<commit_message>
Revise eight classes for twelve learners and publish reading copies
</commit_message>
<xml_diff>
--- a/00_Start_Here/Program_Proposal_and_Resources.docx
+++ b/00_Start_Here/Program_Proposal_and_Resources.docx
@@ -12,18 +12,12 @@
     </w:p>
     <w:p>
       <w:r>
-        <w:rPr>
-          <w:b/>
-        </w:rPr>
-        <w:t xml:space="preserve">Fall 2026 </w:t>
-      </w:r>
-      <w:r>
-        <w:t>An eight session proposal for grades 7 and 8</w:t>
+        <w:t>Fall 2026 An eight session proposal for grades 5 and 6</w:t>
       </w:r>
     </w:p>
     <w:p>
       <w:r>
-        <w:t>MechaRAMS can use the YMCA’s two existing LEGO Education SPIKE Prime kits to offer a small, welcoming robotics program led by trained high school mentors. Students will work in pairs, test a robot every week, and learn to explain a few useful programming ideas through physical results.</w:t>
+        <w:t>MechaRAMS can use the YMCA’s two existing LEGO Education SPIKE Prime kits to offer a small, welcoming robotics program led by trained high school mentors. Students will work in teams, test a robot every week, and learn to explain a few useful programming ideas through physical results.</w:t>
       </w:r>
     </w:p>
     <w:p>
@@ -36,7 +30,7 @@
     </w:p>
     <w:p>
       <w:r>
-        <w:t>Plan for eight students, organized as four pairs sharing two kits. Prefer four laptops so the waiting pairs can edit code; two tested laptops are sufficient with paper planning stations. Schedule eight weekly 60-minute meetings. Keep one driving base assembled per kit and change its job each week.</w:t>
+        <w:t>12 children in grades 5–6 form four teams of three: T1/T2 share Kit A and T3/T4 share Kit B. Four student instructors cover two robot stations and two build tables; a fifth or sixth can float. The adult lead oversees the room and YMCA procedures. Bring four available laptops: two remain connected to robots and two show build references. Printed build cards make the build activity work with two laptops too.</w:t>
       </w:r>
     </w:p>
     <w:p>
@@ -75,7 +69,7 @@
     </w:p>
     <w:p>
       <w:r>
-        <w:t>The user reports an agreement for YMCA space and two SPIKE Prime sets. Enrollment, device availability, session dates, staffing, kit condition, storage, and family registration arrangements remain undecided. This package is a proposal and teaching draft. It has not been piloted with children or tested on the YMCA robots.</w:t>
+        <w:t>The user confirms 12 children in grades 5–6, two SPIKE kits, 4–6 student instructors and four available laptops. Student instructors practiced the materials on October 25 and requested more building, clearer roles and shorter code discussion. Dates, local procedures, inventory and hardware acceptance still need confirmation. No child learning outcomes are claimed.</w:t>
       </w:r>
     </w:p>
     <w:p>
@@ -88,7 +82,7 @@
     </w:p>
     <w:p>
       <w:r>
-        <w:t>Confirm the cohort size, compatible devices, adult supervision arrangements, room and storage, eight dates, mentor availability, and both kits’ working condition. The instructor guide contains a launch checklist. No new kit purchase is required for the recommended eight-student pilot.</w:t>
+        <w:t>Confirm eight dates, adult supervision, room layout, storage, the printing plan and both kits’ working condition. Use the confirmed 12-child grouping and prepare four equal build packs. Inventory available parts before buying supplies.</w:t>
       </w:r>
     </w:p>
     <w:p>
@@ -126,16 +120,16 @@
           <w:tcPr>
             <w:tcW w:type="dxa" w:w="605"/>
             <w:vAlign w:val="center"/>
-            <w:shd w:fill="243E50"/>
             <w:tcBorders>
               <w:top w:val="single" w:sz="4" w:color="D9D9D9"/>
               <w:left w:val="single" w:sz="4" w:color="D9D9D9"/>
               <w:bottom w:val="single" w:sz="4" w:color="D9D9D9"/>
               <w:right w:val="single" w:sz="4" w:color="D9D9D9"/>
             </w:tcBorders>
+            <w:shd w:fill="243E50"/>
             <w:tcMar>
-              <w:top w:w="70" w:type="dxa"/>
-              <w:bottom w:w="70" w:type="dxa"/>
+              <w:top w:w="65" w:type="dxa"/>
+              <w:bottom w:w="65" w:type="dxa"/>
               <w:left w:w="90" w:type="dxa"/>
               <w:right w:w="90" w:type="dxa"/>
             </w:tcMar>
@@ -158,16 +152,16 @@
           <w:tcPr>
             <w:tcW w:type="dxa" w:w="2376"/>
             <w:vAlign w:val="center"/>
-            <w:shd w:fill="243E50"/>
             <w:tcBorders>
               <w:top w:val="single" w:sz="4" w:color="D9D9D9"/>
               <w:left w:val="single" w:sz="4" w:color="D9D9D9"/>
               <w:bottom w:val="single" w:sz="4" w:color="D9D9D9"/>
               <w:right w:val="single" w:sz="4" w:color="D9D9D9"/>
             </w:tcBorders>
+            <w:shd w:fill="243E50"/>
             <w:tcMar>
-              <w:top w:w="70" w:type="dxa"/>
-              <w:bottom w:w="70" w:type="dxa"/>
+              <w:top w:w="65" w:type="dxa"/>
+              <w:bottom w:w="65" w:type="dxa"/>
               <w:left w:w="90" w:type="dxa"/>
               <w:right w:w="90" w:type="dxa"/>
             </w:tcMar>
@@ -190,16 +184,16 @@
           <w:tcPr>
             <w:tcW w:type="dxa" w:w="3384"/>
             <w:vAlign w:val="center"/>
-            <w:shd w:fill="243E50"/>
             <w:tcBorders>
               <w:top w:val="single" w:sz="4" w:color="D9D9D9"/>
               <w:left w:val="single" w:sz="4" w:color="D9D9D9"/>
               <w:bottom w:val="single" w:sz="4" w:color="D9D9D9"/>
               <w:right w:val="single" w:sz="4" w:color="D9D9D9"/>
             </w:tcBorders>
+            <w:shd w:fill="243E50"/>
             <w:tcMar>
-              <w:top w:w="70" w:type="dxa"/>
-              <w:bottom w:w="70" w:type="dxa"/>
+              <w:top w:w="65" w:type="dxa"/>
+              <w:bottom w:w="65" w:type="dxa"/>
               <w:left w:w="90" w:type="dxa"/>
               <w:right w:w="90" w:type="dxa"/>
             </w:tcMar>
@@ -222,16 +216,16 @@
           <w:tcPr>
             <w:tcW w:type="dxa" w:w="3816"/>
             <w:vAlign w:val="center"/>
-            <w:shd w:fill="243E50"/>
             <w:tcBorders>
               <w:top w:val="single" w:sz="4" w:color="D9D9D9"/>
               <w:left w:val="single" w:sz="4" w:color="D9D9D9"/>
               <w:bottom w:val="single" w:sz="4" w:color="D9D9D9"/>
               <w:right w:val="single" w:sz="4" w:color="D9D9D9"/>
             </w:tcBorders>
+            <w:shd w:fill="243E50"/>
             <w:tcMar>
-              <w:top w:w="70" w:type="dxa"/>
-              <w:bottom w:w="70" w:type="dxa"/>
+              <w:top w:w="65" w:type="dxa"/>
+              <w:bottom w:w="65" w:type="dxa"/>
               <w:left w:w="90" w:type="dxa"/>
               <w:right w:w="90" w:type="dxa"/>
             </w:tcMar>
@@ -259,16 +253,16 @@
           <w:tcPr>
             <w:tcW w:type="dxa" w:w="605"/>
             <w:vAlign w:val="center"/>
-            <w:shd w:fill="FFFFFF"/>
             <w:tcBorders>
               <w:top w:val="single" w:sz="4" w:color="D9D9D9"/>
               <w:left w:val="single" w:sz="4" w:color="D9D9D9"/>
               <w:bottom w:val="single" w:sz="4" w:color="D9D9D9"/>
               <w:right w:val="single" w:sz="4" w:color="D9D9D9"/>
             </w:tcBorders>
+            <w:shd w:fill="FFFFFF"/>
             <w:tcMar>
-              <w:top w:w="70" w:type="dxa"/>
-              <w:bottom w:w="70" w:type="dxa"/>
+              <w:top w:w="65" w:type="dxa"/>
+              <w:bottom w:w="65" w:type="dxa"/>
               <w:left w:w="90" w:type="dxa"/>
               <w:right w:w="90" w:type="dxa"/>
             </w:tcMar>
@@ -279,6 +273,7 @@
             </w:pPr>
             <w:r>
               <w:rPr>
+                <w:color w:val="000000"/>
                 <w:sz w:val="18"/>
               </w:rPr>
               <w:t>1</w:t>
@@ -289,16 +284,16 @@
           <w:tcPr>
             <w:tcW w:type="dxa" w:w="2376"/>
             <w:vAlign w:val="center"/>
-            <w:shd w:fill="FFFFFF"/>
             <w:tcBorders>
               <w:top w:val="single" w:sz="4" w:color="D9D9D9"/>
               <w:left w:val="single" w:sz="4" w:color="D9D9D9"/>
               <w:bottom w:val="single" w:sz="4" w:color="D9D9D9"/>
               <w:right w:val="single" w:sz="4" w:color="D9D9D9"/>
             </w:tcBorders>
+            <w:shd w:fill="FFFFFF"/>
             <w:tcMar>
-              <w:top w:w="70" w:type="dxa"/>
-              <w:bottom w:w="70" w:type="dxa"/>
+              <w:top w:w="65" w:type="dxa"/>
+              <w:bottom w:w="65" w:type="dxa"/>
               <w:left w:w="90" w:type="dxa"/>
               <w:right w:w="90" w:type="dxa"/>
             </w:tcMar>
@@ -309,6 +304,7 @@
             </w:pPr>
             <w:r>
               <w:rPr>
+                <w:color w:val="000000"/>
                 <w:sz w:val="18"/>
               </w:rPr>
               <w:t>Meet your robot</w:t>
@@ -319,16 +315,16 @@
           <w:tcPr>
             <w:tcW w:type="dxa" w:w="3384"/>
             <w:vAlign w:val="center"/>
-            <w:shd w:fill="FFFFFF"/>
             <w:tcBorders>
               <w:top w:val="single" w:sz="4" w:color="D9D9D9"/>
               <w:left w:val="single" w:sz="4" w:color="D9D9D9"/>
               <w:bottom w:val="single" w:sz="4" w:color="D9D9D9"/>
               <w:right w:val="single" w:sz="4" w:color="D9D9D9"/>
             </w:tcBorders>
+            <w:shd w:fill="FFFFFF"/>
             <w:tcMar>
-              <w:top w:w="70" w:type="dxa"/>
-              <w:bottom w:w="70" w:type="dxa"/>
+              <w:top w:w="65" w:type="dxa"/>
+              <w:bottom w:w="65" w:type="dxa"/>
               <w:left w:w="90" w:type="dxa"/>
               <w:right w:w="90" w:type="dxa"/>
             </w:tcMar>
@@ -339,6 +335,7 @@
             </w:pPr>
             <w:r>
               <w:rPr>
+                <w:color w:val="000000"/>
                 <w:sz w:val="18"/>
               </w:rPr>
               <w:t>Sequence and a function call</w:t>
@@ -349,16 +346,16 @@
           <w:tcPr>
             <w:tcW w:type="dxa" w:w="3816"/>
             <w:vAlign w:val="center"/>
-            <w:shd w:fill="FFFFFF"/>
             <w:tcBorders>
               <w:top w:val="single" w:sz="4" w:color="D9D9D9"/>
               <w:left w:val="single" w:sz="4" w:color="D9D9D9"/>
               <w:bottom w:val="single" w:sz="4" w:color="D9D9D9"/>
               <w:right w:val="single" w:sz="4" w:color="D9D9D9"/>
             </w:tcBorders>
+            <w:shd w:fill="FFFFFF"/>
             <w:tcMar>
-              <w:top w:w="70" w:type="dxa"/>
-              <w:bottom w:w="70" w:type="dxa"/>
+              <w:top w:w="65" w:type="dxa"/>
+              <w:bottom w:w="65" w:type="dxa"/>
               <w:left w:w="90" w:type="dxa"/>
               <w:right w:w="90" w:type="dxa"/>
             </w:tcMar>
@@ -369,6 +366,7 @@
             </w:pPr>
             <w:r>
               <w:rPr>
+                <w:color w:val="000000"/>
                 <w:sz w:val="18"/>
               </w:rPr>
               <w:t>Letter and action order</w:t>
@@ -384,16 +382,16 @@
           <w:tcPr>
             <w:tcW w:type="dxa" w:w="605"/>
             <w:vAlign w:val="center"/>
-            <w:shd w:fill="F2F5F6"/>
             <w:tcBorders>
               <w:top w:val="single" w:sz="4" w:color="D9D9D9"/>
               <w:left w:val="single" w:sz="4" w:color="D9D9D9"/>
               <w:bottom w:val="single" w:sz="4" w:color="D9D9D9"/>
               <w:right w:val="single" w:sz="4" w:color="D9D9D9"/>
             </w:tcBorders>
+            <w:shd w:fill="F2F5F6"/>
             <w:tcMar>
-              <w:top w:w="70" w:type="dxa"/>
-              <w:bottom w:w="70" w:type="dxa"/>
+              <w:top w:w="65" w:type="dxa"/>
+              <w:bottom w:w="65" w:type="dxa"/>
               <w:left w:w="90" w:type="dxa"/>
               <w:right w:w="90" w:type="dxa"/>
             </w:tcMar>
@@ -404,6 +402,7 @@
             </w:pPr>
             <w:r>
               <w:rPr>
+                <w:color w:val="000000"/>
                 <w:sz w:val="18"/>
               </w:rPr>
               <w:t>2</w:t>
@@ -414,16 +413,16 @@
           <w:tcPr>
             <w:tcW w:type="dxa" w:w="2376"/>
             <w:vAlign w:val="center"/>
-            <w:shd w:fill="F2F5F6"/>
             <w:tcBorders>
               <w:top w:val="single" w:sz="4" w:color="D9D9D9"/>
               <w:left w:val="single" w:sz="4" w:color="D9D9D9"/>
               <w:bottom w:val="single" w:sz="4" w:color="D9D9D9"/>
               <w:right w:val="single" w:sz="4" w:color="D9D9D9"/>
             </w:tcBorders>
+            <w:shd w:fill="F2F5F6"/>
             <w:tcMar>
-              <w:top w:w="70" w:type="dxa"/>
-              <w:bottom w:w="70" w:type="dxa"/>
+              <w:top w:w="65" w:type="dxa"/>
+              <w:bottom w:w="65" w:type="dxa"/>
               <w:left w:w="90" w:type="dxa"/>
               <w:right w:w="90" w:type="dxa"/>
             </w:tcMar>
@@ -434,6 +433,7 @@
             </w:pPr>
             <w:r>
               <w:rPr>
+                <w:color w:val="000000"/>
                 <w:sz w:val="18"/>
               </w:rPr>
               <w:t>Delivery to a target</w:t>
@@ -444,16 +444,16 @@
           <w:tcPr>
             <w:tcW w:type="dxa" w:w="3384"/>
             <w:vAlign w:val="center"/>
-            <w:shd w:fill="F2F5F6"/>
             <w:tcBorders>
               <w:top w:val="single" w:sz="4" w:color="D9D9D9"/>
               <w:left w:val="single" w:sz="4" w:color="D9D9D9"/>
               <w:bottom w:val="single" w:sz="4" w:color="D9D9D9"/>
               <w:right w:val="single" w:sz="4" w:color="D9D9D9"/>
             </w:tcBorders>
+            <w:shd w:fill="F2F5F6"/>
             <w:tcMar>
-              <w:top w:w="70" w:type="dxa"/>
-              <w:bottom w:w="70" w:type="dxa"/>
+              <w:top w:w="65" w:type="dxa"/>
+              <w:bottom w:w="65" w:type="dxa"/>
               <w:left w:w="90" w:type="dxa"/>
               <w:right w:w="90" w:type="dxa"/>
             </w:tcMar>
@@ -464,6 +464,7 @@
             </w:pPr>
             <w:r>
               <w:rPr>
+                <w:color w:val="000000"/>
                 <w:sz w:val="18"/>
               </w:rPr>
               <w:t>Variables and a fair test</w:t>
@@ -474,16 +475,16 @@
           <w:tcPr>
             <w:tcW w:type="dxa" w:w="3816"/>
             <w:vAlign w:val="center"/>
-            <w:shd w:fill="F2F5F6"/>
             <w:tcBorders>
               <w:top w:val="single" w:sz="4" w:color="D9D9D9"/>
               <w:left w:val="single" w:sz="4" w:color="D9D9D9"/>
               <w:bottom w:val="single" w:sz="4" w:color="D9D9D9"/>
               <w:right w:val="single" w:sz="4" w:color="D9D9D9"/>
             </w:tcBorders>
+            <w:shd w:fill="F2F5F6"/>
             <w:tcMar>
-              <w:top w:w="70" w:type="dxa"/>
-              <w:bottom w:w="70" w:type="dxa"/>
+              <w:top w:w="65" w:type="dxa"/>
+              <w:bottom w:w="65" w:type="dxa"/>
               <w:left w:w="90" w:type="dxa"/>
               <w:right w:w="90" w:type="dxa"/>
             </w:tcMar>
@@ -494,6 +495,7 @@
             </w:pPr>
             <w:r>
               <w:rPr>
+                <w:color w:val="000000"/>
                 <w:sz w:val="18"/>
               </w:rPr>
               <w:t>Travel in cm</w:t>
@@ -509,16 +511,16 @@
           <w:tcPr>
             <w:tcW w:type="dxa" w:w="605"/>
             <w:vAlign w:val="center"/>
-            <w:shd w:fill="FFFFFF"/>
             <w:tcBorders>
               <w:top w:val="single" w:sz="4" w:color="D9D9D9"/>
               <w:left w:val="single" w:sz="4" w:color="D9D9D9"/>
               <w:bottom w:val="single" w:sz="4" w:color="D9D9D9"/>
               <w:right w:val="single" w:sz="4" w:color="D9D9D9"/>
             </w:tcBorders>
+            <w:shd w:fill="FFFFFF"/>
             <w:tcMar>
-              <w:top w:w="70" w:type="dxa"/>
-              <w:bottom w:w="70" w:type="dxa"/>
+              <w:top w:w="65" w:type="dxa"/>
+              <w:bottom w:w="65" w:type="dxa"/>
               <w:left w:w="90" w:type="dxa"/>
               <w:right w:w="90" w:type="dxa"/>
             </w:tcMar>
@@ -529,6 +531,7 @@
             </w:pPr>
             <w:r>
               <w:rPr>
+                <w:color w:val="000000"/>
                 <w:sz w:val="18"/>
               </w:rPr>
               <w:t>3</w:t>
@@ -539,16 +542,16 @@
           <w:tcPr>
             <w:tcW w:type="dxa" w:w="2376"/>
             <w:vAlign w:val="center"/>
-            <w:shd w:fill="FFFFFF"/>
             <w:tcBorders>
               <w:top w:val="single" w:sz="4" w:color="D9D9D9"/>
               <w:left w:val="single" w:sz="4" w:color="D9D9D9"/>
               <w:bottom w:val="single" w:sz="4" w:color="D9D9D9"/>
               <w:right w:val="single" w:sz="4" w:color="D9D9D9"/>
             </w:tcBorders>
+            <w:shd w:fill="FFFFFF"/>
             <w:tcMar>
-              <w:top w:w="70" w:type="dxa"/>
-              <w:bottom w:w="70" w:type="dxa"/>
+              <w:top w:w="65" w:type="dxa"/>
+              <w:bottom w:w="65" w:type="dxa"/>
               <w:left w:w="90" w:type="dxa"/>
               <w:right w:w="90" w:type="dxa"/>
             </w:tcMar>
@@ -559,6 +562,7 @@
             </w:pPr>
             <w:r>
               <w:rPr>
+                <w:color w:val="000000"/>
                 <w:sz w:val="18"/>
               </w:rPr>
               <w:t>Robot dance studio</w:t>
@@ -569,16 +573,16 @@
           <w:tcPr>
             <w:tcW w:type="dxa" w:w="3384"/>
             <w:vAlign w:val="center"/>
-            <w:shd w:fill="FFFFFF"/>
             <w:tcBorders>
               <w:top w:val="single" w:sz="4" w:color="D9D9D9"/>
               <w:left w:val="single" w:sz="4" w:color="D9D9D9"/>
               <w:bottom w:val="single" w:sz="4" w:color="D9D9D9"/>
               <w:right w:val="single" w:sz="4" w:color="D9D9D9"/>
             </w:tcBorders>
+            <w:shd w:fill="FFFFFF"/>
             <w:tcMar>
-              <w:top w:w="70" w:type="dxa"/>
-              <w:bottom w:w="70" w:type="dxa"/>
+              <w:top w:w="65" w:type="dxa"/>
+              <w:bottom w:w="65" w:type="dxa"/>
               <w:left w:w="90" w:type="dxa"/>
               <w:right w:w="90" w:type="dxa"/>
             </w:tcMar>
@@ -589,6 +593,7 @@
             </w:pPr>
             <w:r>
               <w:rPr>
+                <w:color w:val="000000"/>
                 <w:sz w:val="18"/>
               </w:rPr>
               <w:t>Counted loops and indentation</w:t>
@@ -599,16 +604,16 @@
           <w:tcPr>
             <w:tcW w:type="dxa" w:w="3816"/>
             <w:vAlign w:val="center"/>
-            <w:shd w:fill="FFFFFF"/>
             <w:tcBorders>
               <w:top w:val="single" w:sz="4" w:color="D9D9D9"/>
               <w:left w:val="single" w:sz="4" w:color="D9D9D9"/>
               <w:bottom w:val="single" w:sz="4" w:color="D9D9D9"/>
               <w:right w:val="single" w:sz="4" w:color="D9D9D9"/>
             </w:tcBorders>
+            <w:shd w:fill="FFFFFF"/>
             <w:tcMar>
-              <w:top w:w="70" w:type="dxa"/>
-              <w:bottom w:w="70" w:type="dxa"/>
+              <w:top w:w="65" w:type="dxa"/>
+              <w:bottom w:w="65" w:type="dxa"/>
               <w:left w:w="90" w:type="dxa"/>
               <w:right w:w="90" w:type="dxa"/>
             </w:tcMar>
@@ -619,6 +624,7 @@
             </w:pPr>
             <w:r>
               <w:rPr>
+                <w:color w:val="000000"/>
                 <w:sz w:val="18"/>
               </w:rPr>
               <w:t>Movement count</w:t>
@@ -634,16 +640,16 @@
           <w:tcPr>
             <w:tcW w:type="dxa" w:w="605"/>
             <w:vAlign w:val="center"/>
-            <w:shd w:fill="F2F5F6"/>
             <w:tcBorders>
               <w:top w:val="single" w:sz="4" w:color="D9D9D9"/>
               <w:left w:val="single" w:sz="4" w:color="D9D9D9"/>
               <w:bottom w:val="single" w:sz="4" w:color="D9D9D9"/>
               <w:right w:val="single" w:sz="4" w:color="D9D9D9"/>
             </w:tcBorders>
+            <w:shd w:fill="F2F5F6"/>
             <w:tcMar>
-              <w:top w:w="70" w:type="dxa"/>
-              <w:bottom w:w="70" w:type="dxa"/>
+              <w:top w:w="65" w:type="dxa"/>
+              <w:bottom w:w="65" w:type="dxa"/>
               <w:left w:w="90" w:type="dxa"/>
               <w:right w:w="90" w:type="dxa"/>
             </w:tcMar>
@@ -654,6 +660,7 @@
             </w:pPr>
             <w:r>
               <w:rPr>
+                <w:color w:val="000000"/>
                 <w:sz w:val="18"/>
               </w:rPr>
               <w:t>4</w:t>
@@ -664,16 +671,16 @@
           <w:tcPr>
             <w:tcW w:type="dxa" w:w="2376"/>
             <w:vAlign w:val="center"/>
-            <w:shd w:fill="F2F5F6"/>
             <w:tcBorders>
               <w:top w:val="single" w:sz="4" w:color="D9D9D9"/>
               <w:left w:val="single" w:sz="4" w:color="D9D9D9"/>
               <w:bottom w:val="single" w:sz="4" w:color="D9D9D9"/>
               <w:right w:val="single" w:sz="4" w:color="D9D9D9"/>
             </w:tcBorders>
+            <w:shd w:fill="F2F5F6"/>
             <w:tcMar>
-              <w:top w:w="70" w:type="dxa"/>
-              <w:bottom w:w="70" w:type="dxa"/>
+              <w:top w:w="65" w:type="dxa"/>
+              <w:bottom w:w="65" w:type="dxa"/>
               <w:left w:w="90" w:type="dxa"/>
               <w:right w:w="90" w:type="dxa"/>
             </w:tcMar>
@@ -684,6 +691,7 @@
             </w:pPr>
             <w:r>
               <w:rPr>
+                <w:color w:val="000000"/>
                 <w:sz w:val="18"/>
               </w:rPr>
               <w:t>Parking assistant</w:t>
@@ -694,16 +702,16 @@
           <w:tcPr>
             <w:tcW w:type="dxa" w:w="3384"/>
             <w:vAlign w:val="center"/>
-            <w:shd w:fill="F2F5F6"/>
             <w:tcBorders>
               <w:top w:val="single" w:sz="4" w:color="D9D9D9"/>
               <w:left w:val="single" w:sz="4" w:color="D9D9D9"/>
               <w:bottom w:val="single" w:sz="4" w:color="D9D9D9"/>
               <w:right w:val="single" w:sz="4" w:color="D9D9D9"/>
             </w:tcBorders>
+            <w:shd w:fill="F2F5F6"/>
             <w:tcMar>
-              <w:top w:w="70" w:type="dxa"/>
-              <w:bottom w:w="70" w:type="dxa"/>
+              <w:top w:w="65" w:type="dxa"/>
+              <w:bottom w:w="65" w:type="dxa"/>
               <w:left w:w="90" w:type="dxa"/>
               <w:right w:w="90" w:type="dxa"/>
             </w:tcMar>
@@ -714,6 +722,7 @@
             </w:pPr>
             <w:r>
               <w:rPr>
+                <w:color w:val="000000"/>
                 <w:sz w:val="18"/>
               </w:rPr>
               <w:t>Sensor input and if conditions</w:t>
@@ -724,16 +733,16 @@
           <w:tcPr>
             <w:tcW w:type="dxa" w:w="3816"/>
             <w:vAlign w:val="center"/>
-            <w:shd w:fill="F2F5F6"/>
             <w:tcBorders>
               <w:top w:val="single" w:sz="4" w:color="D9D9D9"/>
               <w:left w:val="single" w:sz="4" w:color="D9D9D9"/>
               <w:bottom w:val="single" w:sz="4" w:color="D9D9D9"/>
               <w:right w:val="single" w:sz="4" w:color="D9D9D9"/>
             </w:tcBorders>
+            <w:shd w:fill="F2F5F6"/>
             <w:tcMar>
-              <w:top w:w="70" w:type="dxa"/>
-              <w:bottom w:w="70" w:type="dxa"/>
+              <w:top w:w="65" w:type="dxa"/>
+              <w:bottom w:w="65" w:type="dxa"/>
               <w:left w:w="90" w:type="dxa"/>
               <w:right w:w="90" w:type="dxa"/>
             </w:tcMar>
@@ -744,6 +753,7 @@
             </w:pPr>
             <w:r>
               <w:rPr>
+                <w:color w:val="000000"/>
                 <w:sz w:val="18"/>
               </w:rPr>
               <w:t>Gap in mm and stop reason</w:t>
@@ -759,16 +769,16 @@
           <w:tcPr>
             <w:tcW w:type="dxa" w:w="605"/>
             <w:vAlign w:val="center"/>
-            <w:shd w:fill="FFFFFF"/>
             <w:tcBorders>
               <w:top w:val="single" w:sz="4" w:color="D9D9D9"/>
               <w:left w:val="single" w:sz="4" w:color="D9D9D9"/>
               <w:bottom w:val="single" w:sz="4" w:color="D9D9D9"/>
               <w:right w:val="single" w:sz="4" w:color="D9D9D9"/>
             </w:tcBorders>
+            <w:shd w:fill="FFFFFF"/>
             <w:tcMar>
-              <w:top w:w="70" w:type="dxa"/>
-              <w:bottom w:w="70" w:type="dxa"/>
+              <w:top w:w="65" w:type="dxa"/>
+              <w:bottom w:w="65" w:type="dxa"/>
               <w:left w:w="90" w:type="dxa"/>
               <w:right w:w="90" w:type="dxa"/>
             </w:tcMar>
@@ -779,6 +789,7 @@
             </w:pPr>
             <w:r>
               <w:rPr>
+                <w:color w:val="000000"/>
                 <w:sz w:val="18"/>
               </w:rPr>
               <w:t>5</w:t>
@@ -789,16 +800,16 @@
           <w:tcPr>
             <w:tcW w:type="dxa" w:w="2376"/>
             <w:vAlign w:val="center"/>
-            <w:shd w:fill="FFFFFF"/>
             <w:tcBorders>
               <w:top w:val="single" w:sz="4" w:color="D9D9D9"/>
               <w:left w:val="single" w:sz="4" w:color="D9D9D9"/>
               <w:bottom w:val="single" w:sz="4" w:color="D9D9D9"/>
               <w:right w:val="single" w:sz="4" w:color="D9D9D9"/>
             </w:tcBorders>
+            <w:shd w:fill="FFFFFF"/>
             <w:tcMar>
-              <w:top w:w="70" w:type="dxa"/>
-              <w:bottom w:w="70" w:type="dxa"/>
+              <w:top w:w="65" w:type="dxa"/>
+              <w:bottom w:w="65" w:type="dxa"/>
               <w:left w:w="90" w:type="dxa"/>
               <w:right w:w="90" w:type="dxa"/>
             </w:tcMar>
@@ -809,6 +820,7 @@
             </w:pPr>
             <w:r>
               <w:rPr>
+                <w:color w:val="000000"/>
                 <w:sz w:val="18"/>
               </w:rPr>
               <w:t>The floor tells the robot</w:t>
@@ -819,16 +831,16 @@
           <w:tcPr>
             <w:tcW w:type="dxa" w:w="3384"/>
             <w:vAlign w:val="center"/>
-            <w:shd w:fill="FFFFFF"/>
             <w:tcBorders>
               <w:top w:val="single" w:sz="4" w:color="D9D9D9"/>
               <w:left w:val="single" w:sz="4" w:color="D9D9D9"/>
               <w:bottom w:val="single" w:sz="4" w:color="D9D9D9"/>
               <w:right w:val="single" w:sz="4" w:color="D9D9D9"/>
             </w:tcBorders>
+            <w:shd w:fill="FFFFFF"/>
             <w:tcMar>
-              <w:top w:w="70" w:type="dxa"/>
-              <w:bottom w:w="70" w:type="dxa"/>
+              <w:top w:w="65" w:type="dxa"/>
+              <w:bottom w:w="65" w:type="dxa"/>
               <w:left w:w="90" w:type="dxa"/>
               <w:right w:w="90" w:type="dxa"/>
             </w:tcMar>
@@ -839,6 +851,7 @@
             </w:pPr>
             <w:r>
               <w:rPr>
+                <w:color w:val="000000"/>
                 <w:sz w:val="18"/>
               </w:rPr>
               <w:t>Calibration and repeated decisions</w:t>
@@ -849,16 +862,16 @@
           <w:tcPr>
             <w:tcW w:type="dxa" w:w="3816"/>
             <w:vAlign w:val="center"/>
-            <w:shd w:fill="FFFFFF"/>
             <w:tcBorders>
               <w:top w:val="single" w:sz="4" w:color="D9D9D9"/>
               <w:left w:val="single" w:sz="4" w:color="D9D9D9"/>
               <w:bottom w:val="single" w:sz="4" w:color="D9D9D9"/>
               <w:right w:val="single" w:sz="4" w:color="D9D9D9"/>
             </w:tcBorders>
+            <w:shd w:fill="FFFFFF"/>
             <w:tcMar>
-              <w:top w:w="70" w:type="dxa"/>
-              <w:bottom w:w="70" w:type="dxa"/>
+              <w:top w:w="65" w:type="dxa"/>
+              <w:bottom w:w="65" w:type="dxa"/>
               <w:left w:w="90" w:type="dxa"/>
               <w:right w:w="90" w:type="dxa"/>
             </w:tcMar>
@@ -869,6 +882,7 @@
             </w:pPr>
             <w:r>
               <w:rPr>
+                <w:color w:val="000000"/>
                 <w:sz w:val="18"/>
               </w:rPr>
               <w:t>Reflection and detection outcome</w:t>
@@ -884,16 +898,16 @@
           <w:tcPr>
             <w:tcW w:type="dxa" w:w="605"/>
             <w:vAlign w:val="center"/>
-            <w:shd w:fill="F2F5F6"/>
             <w:tcBorders>
               <w:top w:val="single" w:sz="4" w:color="D9D9D9"/>
               <w:left w:val="single" w:sz="4" w:color="D9D9D9"/>
               <w:bottom w:val="single" w:sz="4" w:color="D9D9D9"/>
               <w:right w:val="single" w:sz="4" w:color="D9D9D9"/>
             </w:tcBorders>
+            <w:shd w:fill="F2F5F6"/>
             <w:tcMar>
-              <w:top w:w="70" w:type="dxa"/>
-              <w:bottom w:w="70" w:type="dxa"/>
+              <w:top w:w="65" w:type="dxa"/>
+              <w:bottom w:w="65" w:type="dxa"/>
               <w:left w:w="90" w:type="dxa"/>
               <w:right w:w="90" w:type="dxa"/>
             </w:tcMar>
@@ -904,6 +918,7 @@
             </w:pPr>
             <w:r>
               <w:rPr>
+                <w:color w:val="000000"/>
                 <w:sz w:val="18"/>
               </w:rPr>
               <w:t>6</w:t>
@@ -914,16 +929,16 @@
           <w:tcPr>
             <w:tcW w:type="dxa" w:w="2376"/>
             <w:vAlign w:val="center"/>
-            <w:shd w:fill="F2F5F6"/>
             <w:tcBorders>
               <w:top w:val="single" w:sz="4" w:color="D9D9D9"/>
               <w:left w:val="single" w:sz="4" w:color="D9D9D9"/>
               <w:bottom w:val="single" w:sz="4" w:color="D9D9D9"/>
               <w:right w:val="single" w:sz="4" w:color="D9D9D9"/>
             </w:tcBorders>
+            <w:shd w:fill="F2F5F6"/>
             <w:tcMar>
-              <w:top w:w="70" w:type="dxa"/>
-              <w:bottom w:w="70" w:type="dxa"/>
+              <w:top w:w="65" w:type="dxa"/>
+              <w:bottom w:w="65" w:type="dxa"/>
               <w:left w:w="90" w:type="dxa"/>
               <w:right w:w="90" w:type="dxa"/>
             </w:tcMar>
@@ -934,6 +949,7 @@
             </w:pPr>
             <w:r>
               <w:rPr>
+                <w:color w:val="000000"/>
                 <w:sz w:val="18"/>
               </w:rPr>
               <w:t>A rescue attachment</w:t>
@@ -944,16 +960,16 @@
           <w:tcPr>
             <w:tcW w:type="dxa" w:w="3384"/>
             <w:vAlign w:val="center"/>
-            <w:shd w:fill="F2F5F6"/>
             <w:tcBorders>
               <w:top w:val="single" w:sz="4" w:color="D9D9D9"/>
               <w:left w:val="single" w:sz="4" w:color="D9D9D9"/>
               <w:bottom w:val="single" w:sz="4" w:color="D9D9D9"/>
               <w:right w:val="single" w:sz="4" w:color="D9D9D9"/>
             </w:tcBorders>
+            <w:shd w:fill="F2F5F6"/>
             <w:tcMar>
-              <w:top w:w="70" w:type="dxa"/>
-              <w:bottom w:w="70" w:type="dxa"/>
+              <w:top w:w="65" w:type="dxa"/>
+              <w:bottom w:w="65" w:type="dxa"/>
               <w:left w:w="90" w:type="dxa"/>
               <w:right w:w="90" w:type="dxa"/>
             </w:tcMar>
@@ -964,6 +980,7 @@
             </w:pPr>
             <w:r>
               <w:rPr>
+                <w:color w:val="000000"/>
                 <w:sz w:val="18"/>
               </w:rPr>
               <w:t>Engineering design and reusable functions</w:t>
@@ -974,16 +991,16 @@
           <w:tcPr>
             <w:tcW w:type="dxa" w:w="3816"/>
             <w:vAlign w:val="center"/>
-            <w:shd w:fill="F2F5F6"/>
             <w:tcBorders>
               <w:top w:val="single" w:sz="4" w:color="D9D9D9"/>
               <w:left w:val="single" w:sz="4" w:color="D9D9D9"/>
               <w:bottom w:val="single" w:sz="4" w:color="D9D9D9"/>
               <w:right w:val="single" w:sz="4" w:color="D9D9D9"/>
             </w:tcBorders>
+            <w:shd w:fill="F2F5F6"/>
             <w:tcMar>
-              <w:top w:w="70" w:type="dxa"/>
-              <w:bottom w:w="70" w:type="dxa"/>
+              <w:top w:w="65" w:type="dxa"/>
+              <w:bottom w:w="65" w:type="dxa"/>
               <w:left w:w="90" w:type="dxa"/>
               <w:right w:w="90" w:type="dxa"/>
             </w:tcMar>
@@ -994,6 +1011,7 @@
             </w:pPr>
             <w:r>
               <w:rPr>
+                <w:color w:val="000000"/>
                 <w:sz w:val="18"/>
               </w:rPr>
               <w:t>Controlled deliveries out of attempts</w:t>
@@ -1009,16 +1027,16 @@
           <w:tcPr>
             <w:tcW w:type="dxa" w:w="605"/>
             <w:vAlign w:val="center"/>
-            <w:shd w:fill="FFFFFF"/>
             <w:tcBorders>
               <w:top w:val="single" w:sz="4" w:color="D9D9D9"/>
               <w:left w:val="single" w:sz="4" w:color="D9D9D9"/>
               <w:bottom w:val="single" w:sz="4" w:color="D9D9D9"/>
               <w:right w:val="single" w:sz="4" w:color="D9D9D9"/>
             </w:tcBorders>
+            <w:shd w:fill="FFFFFF"/>
             <w:tcMar>
-              <w:top w:w="70" w:type="dxa"/>
-              <w:bottom w:w="70" w:type="dxa"/>
+              <w:top w:w="65" w:type="dxa"/>
+              <w:bottom w:w="65" w:type="dxa"/>
               <w:left w:w="90" w:type="dxa"/>
               <w:right w:w="90" w:type="dxa"/>
             </w:tcMar>
@@ -1029,6 +1047,7 @@
             </w:pPr>
             <w:r>
               <w:rPr>
+                <w:color w:val="000000"/>
                 <w:sz w:val="18"/>
               </w:rPr>
               <w:t>7</w:t>
@@ -1039,16 +1058,16 @@
           <w:tcPr>
             <w:tcW w:type="dxa" w:w="2376"/>
             <w:vAlign w:val="center"/>
-            <w:shd w:fill="FFFFFF"/>
             <w:tcBorders>
               <w:top w:val="single" w:sz="4" w:color="D9D9D9"/>
               <w:left w:val="single" w:sz="4" w:color="D9D9D9"/>
               <w:bottom w:val="single" w:sz="4" w:color="D9D9D9"/>
               <w:right w:val="single" w:sz="4" w:color="D9D9D9"/>
             </w:tcBorders>
+            <w:shd w:fill="FFFFFF"/>
             <w:tcMar>
-              <w:top w:w="70" w:type="dxa"/>
-              <w:bottom w:w="70" w:type="dxa"/>
+              <w:top w:w="65" w:type="dxa"/>
+              <w:bottom w:w="65" w:type="dxa"/>
               <w:left w:w="90" w:type="dxa"/>
               <w:right w:w="90" w:type="dxa"/>
             </w:tcMar>
@@ -1059,6 +1078,7 @@
             </w:pPr>
             <w:r>
               <w:rPr>
+                <w:color w:val="000000"/>
                 <w:sz w:val="18"/>
               </w:rPr>
               <w:t>Community robot mission</w:t>
@@ -1069,16 +1089,16 @@
           <w:tcPr>
             <w:tcW w:type="dxa" w:w="3384"/>
             <w:vAlign w:val="center"/>
-            <w:shd w:fill="FFFFFF"/>
             <w:tcBorders>
               <w:top w:val="single" w:sz="4" w:color="D9D9D9"/>
               <w:left w:val="single" w:sz="4" w:color="D9D9D9"/>
               <w:bottom w:val="single" w:sz="4" w:color="D9D9D9"/>
               <w:right w:val="single" w:sz="4" w:color="D9D9D9"/>
             </w:tcBorders>
+            <w:shd w:fill="FFFFFF"/>
             <w:tcMar>
-              <w:top w:w="70" w:type="dxa"/>
-              <w:bottom w:w="70" w:type="dxa"/>
+              <w:top w:w="65" w:type="dxa"/>
+              <w:bottom w:w="65" w:type="dxa"/>
               <w:left w:w="90" w:type="dxa"/>
               <w:right w:w="90" w:type="dxa"/>
             </w:tcMar>
@@ -1089,6 +1109,7 @@
             </w:pPr>
             <w:r>
               <w:rPr>
+                <w:color w:val="000000"/>
                 <w:sz w:val="18"/>
               </w:rPr>
               <w:t>Decomposition and integration</w:t>
@@ -1099,16 +1120,16 @@
           <w:tcPr>
             <w:tcW w:type="dxa" w:w="3816"/>
             <w:vAlign w:val="center"/>
-            <w:shd w:fill="FFFFFF"/>
             <w:tcBorders>
               <w:top w:val="single" w:sz="4" w:color="D9D9D9"/>
               <w:left w:val="single" w:sz="4" w:color="D9D9D9"/>
               <w:bottom w:val="single" w:sz="4" w:color="D9D9D9"/>
               <w:right w:val="single" w:sz="4" w:color="D9D9D9"/>
             </w:tcBorders>
+            <w:shd w:fill="FFFFFF"/>
             <w:tcMar>
-              <w:top w:w="70" w:type="dxa"/>
-              <w:bottom w:w="70" w:type="dxa"/>
+              <w:top w:w="65" w:type="dxa"/>
+              <w:bottom w:w="65" w:type="dxa"/>
               <w:left w:w="90" w:type="dxa"/>
               <w:right w:w="90" w:type="dxa"/>
             </w:tcMar>
@@ -1119,9 +1140,10 @@
             </w:pPr>
             <w:r>
               <w:rPr>
+                <w:color w:val="000000"/>
                 <w:sz w:val="18"/>
               </w:rPr>
-              <w:t>Pair-defined success criterion</w:t>
+              <w:t>Team-defined success criterion</w:t>
             </w:r>
           </w:p>
         </w:tc>
@@ -1134,16 +1156,16 @@
           <w:tcPr>
             <w:tcW w:type="dxa" w:w="605"/>
             <w:vAlign w:val="center"/>
-            <w:shd w:fill="F2F5F6"/>
             <w:tcBorders>
               <w:top w:val="single" w:sz="4" w:color="D9D9D9"/>
               <w:left w:val="single" w:sz="4" w:color="D9D9D9"/>
               <w:bottom w:val="single" w:sz="4" w:color="D9D9D9"/>
               <w:right w:val="single" w:sz="4" w:color="D9D9D9"/>
             </w:tcBorders>
+            <w:shd w:fill="F2F5F6"/>
             <w:tcMar>
-              <w:top w:w="70" w:type="dxa"/>
-              <w:bottom w:w="70" w:type="dxa"/>
+              <w:top w:w="65" w:type="dxa"/>
+              <w:bottom w:w="65" w:type="dxa"/>
               <w:left w:w="90" w:type="dxa"/>
               <w:right w:w="90" w:type="dxa"/>
             </w:tcMar>
@@ -1154,6 +1176,7 @@
             </w:pPr>
             <w:r>
               <w:rPr>
+                <w:color w:val="000000"/>
                 <w:sz w:val="18"/>
               </w:rPr>
               <w:t>8</w:t>
@@ -1164,16 +1187,16 @@
           <w:tcPr>
             <w:tcW w:type="dxa" w:w="2376"/>
             <w:vAlign w:val="center"/>
-            <w:shd w:fill="F2F5F6"/>
             <w:tcBorders>
               <w:top w:val="single" w:sz="4" w:color="D9D9D9"/>
               <w:left w:val="single" w:sz="4" w:color="D9D9D9"/>
               <w:bottom w:val="single" w:sz="4" w:color="D9D9D9"/>
               <w:right w:val="single" w:sz="4" w:color="D9D9D9"/>
             </w:tcBorders>
+            <w:shd w:fill="F2F5F6"/>
             <w:tcMar>
-              <w:top w:w="70" w:type="dxa"/>
-              <w:bottom w:w="70" w:type="dxa"/>
+              <w:top w:w="65" w:type="dxa"/>
+              <w:bottom w:w="65" w:type="dxa"/>
               <w:left w:w="90" w:type="dxa"/>
               <w:right w:w="90" w:type="dxa"/>
             </w:tcMar>
@@ -1184,6 +1207,7 @@
             </w:pPr>
             <w:r>
               <w:rPr>
+                <w:color w:val="000000"/>
                 <w:sz w:val="18"/>
               </w:rPr>
               <w:t>Robot showcase</w:t>
@@ -1194,16 +1218,16 @@
           <w:tcPr>
             <w:tcW w:type="dxa" w:w="3384"/>
             <w:vAlign w:val="center"/>
-            <w:shd w:fill="F2F5F6"/>
             <w:tcBorders>
               <w:top w:val="single" w:sz="4" w:color="D9D9D9"/>
               <w:left w:val="single" w:sz="4" w:color="D9D9D9"/>
               <w:bottom w:val="single" w:sz="4" w:color="D9D9D9"/>
               <w:right w:val="single" w:sz="4" w:color="D9D9D9"/>
             </w:tcBorders>
+            <w:shd w:fill="F2F5F6"/>
             <w:tcMar>
-              <w:top w:w="70" w:type="dxa"/>
-              <w:bottom w:w="70" w:type="dxa"/>
+              <w:top w:w="65" w:type="dxa"/>
+              <w:bottom w:w="65" w:type="dxa"/>
               <w:left w:w="90" w:type="dxa"/>
               <w:right w:w="90" w:type="dxa"/>
             </w:tcMar>
@@ -1214,6 +1238,7 @@
             </w:pPr>
             <w:r>
               <w:rPr>
+                <w:color w:val="000000"/>
                 <w:sz w:val="18"/>
               </w:rPr>
               <w:t>Explanation, evidence, and reflection</w:t>
@@ -1224,16 +1249,16 @@
           <w:tcPr>
             <w:tcW w:type="dxa" w:w="3816"/>
             <w:vAlign w:val="center"/>
-            <w:shd w:fill="F2F5F6"/>
             <w:tcBorders>
               <w:top w:val="single" w:sz="4" w:color="D9D9D9"/>
               <w:left w:val="single" w:sz="4" w:color="D9D9D9"/>
               <w:bottom w:val="single" w:sz="4" w:color="D9D9D9"/>
               <w:right w:val="single" w:sz="4" w:color="D9D9D9"/>
             </w:tcBorders>
+            <w:shd w:fill="F2F5F6"/>
             <w:tcMar>
-              <w:top w:w="70" w:type="dxa"/>
-              <w:bottom w:w="70" w:type="dxa"/>
+              <w:top w:w="65" w:type="dxa"/>
+              <w:bottom w:w="65" w:type="dxa"/>
               <w:left w:w="90" w:type="dxa"/>
               <w:right w:w="90" w:type="dxa"/>
             </w:tcMar>
@@ -1244,6 +1269,7 @@
             </w:pPr>
             <w:r>
               <w:rPr>
+                <w:color w:val="000000"/>
                 <w:sz w:val="18"/>
               </w:rPr>
               <w:t>Observed result and individual explanation</w:t>
@@ -1331,16 +1357,16 @@
           <w:tcPr>
             <w:tcW w:type="dxa" w:w="864"/>
             <w:vAlign w:val="center"/>
-            <w:shd w:fill="243E50"/>
             <w:tcBorders>
               <w:top w:val="single" w:sz="4" w:color="D9D9D9"/>
               <w:left w:val="single" w:sz="4" w:color="D9D9D9"/>
               <w:bottom w:val="single" w:sz="4" w:color="D9D9D9"/>
               <w:right w:val="single" w:sz="4" w:color="D9D9D9"/>
             </w:tcBorders>
+            <w:shd w:fill="243E50"/>
             <w:tcMar>
-              <w:top w:w="70" w:type="dxa"/>
-              <w:bottom w:w="70" w:type="dxa"/>
+              <w:top w:w="65" w:type="dxa"/>
+              <w:bottom w:w="65" w:type="dxa"/>
               <w:left w:w="90" w:type="dxa"/>
               <w:right w:w="90" w:type="dxa"/>
             </w:tcMar>
@@ -1363,16 +1389,16 @@
           <w:tcPr>
             <w:tcW w:type="dxa" w:w="2016"/>
             <w:vAlign w:val="center"/>
-            <w:shd w:fill="243E50"/>
             <w:tcBorders>
               <w:top w:val="single" w:sz="4" w:color="D9D9D9"/>
               <w:left w:val="single" w:sz="4" w:color="D9D9D9"/>
               <w:bottom w:val="single" w:sz="4" w:color="D9D9D9"/>
               <w:right w:val="single" w:sz="4" w:color="D9D9D9"/>
             </w:tcBorders>
+            <w:shd w:fill="243E50"/>
             <w:tcMar>
-              <w:top w:w="70" w:type="dxa"/>
-              <w:bottom w:w="70" w:type="dxa"/>
+              <w:top w:w="65" w:type="dxa"/>
+              <w:bottom w:w="65" w:type="dxa"/>
               <w:left w:w="90" w:type="dxa"/>
               <w:right w:w="90" w:type="dxa"/>
             </w:tcMar>
@@ -1395,16 +1421,16 @@
           <w:tcPr>
             <w:tcW w:type="dxa" w:w="2592"/>
             <w:vAlign w:val="center"/>
-            <w:shd w:fill="243E50"/>
             <w:tcBorders>
               <w:top w:val="single" w:sz="4" w:color="D9D9D9"/>
               <w:left w:val="single" w:sz="4" w:color="D9D9D9"/>
               <w:bottom w:val="single" w:sz="4" w:color="D9D9D9"/>
               <w:right w:val="single" w:sz="4" w:color="D9D9D9"/>
             </w:tcBorders>
+            <w:shd w:fill="243E50"/>
             <w:tcMar>
-              <w:top w:w="70" w:type="dxa"/>
-              <w:bottom w:w="70" w:type="dxa"/>
+              <w:top w:w="65" w:type="dxa"/>
+              <w:bottom w:w="65" w:type="dxa"/>
               <w:left w:w="90" w:type="dxa"/>
               <w:right w:w="90" w:type="dxa"/>
             </w:tcMar>
@@ -1427,16 +1453,16 @@
           <w:tcPr>
             <w:tcW w:type="dxa" w:w="4709"/>
             <w:vAlign w:val="center"/>
-            <w:shd w:fill="243E50"/>
             <w:tcBorders>
               <w:top w:val="single" w:sz="4" w:color="D9D9D9"/>
               <w:left w:val="single" w:sz="4" w:color="D9D9D9"/>
               <w:bottom w:val="single" w:sz="4" w:color="D9D9D9"/>
               <w:right w:val="single" w:sz="4" w:color="D9D9D9"/>
             </w:tcBorders>
+            <w:shd w:fill="243E50"/>
             <w:tcMar>
-              <w:top w:w="70" w:type="dxa"/>
-              <w:bottom w:w="70" w:type="dxa"/>
+              <w:top w:w="65" w:type="dxa"/>
+              <w:bottom w:w="65" w:type="dxa"/>
               <w:left w:w="90" w:type="dxa"/>
               <w:right w:w="90" w:type="dxa"/>
             </w:tcMar>
@@ -1463,17 +1489,16 @@
         <w:tc>
           <w:tcPr>
             <w:tcW w:type="dxa" w:w="864"/>
-            <w:vAlign w:val="center"/>
-            <w:shd w:fill="FFFFFF"/>
             <w:tcBorders>
               <w:top w:val="single" w:sz="4" w:color="D9D9D9"/>
               <w:left w:val="single" w:sz="4" w:color="D9D9D9"/>
               <w:bottom w:val="single" w:sz="4" w:color="D9D9D9"/>
               <w:right w:val="single" w:sz="4" w:color="D9D9D9"/>
             </w:tcBorders>
+            <w:shd w:fill="FFFFFF"/>
             <w:tcMar>
-              <w:top w:w="70" w:type="dxa"/>
-              <w:bottom w:w="70" w:type="dxa"/>
+              <w:top w:w="65" w:type="dxa"/>
+              <w:bottom w:w="65" w:type="dxa"/>
               <w:left w:w="90" w:type="dxa"/>
               <w:right w:w="90" w:type="dxa"/>
             </w:tcMar>
@@ -1484,26 +1509,26 @@
             </w:pPr>
             <w:r>
               <w:rPr>
+                <w:color w:val="000000"/>
                 <w:sz w:val="18"/>
               </w:rPr>
-              <w:t>4</w:t>
+              <w:t>12</w:t>
             </w:r>
           </w:p>
         </w:tc>
         <w:tc>
           <w:tcPr>
             <w:tcW w:type="dxa" w:w="2016"/>
-            <w:vAlign w:val="center"/>
-            <w:shd w:fill="FFFFFF"/>
             <w:tcBorders>
               <w:top w:val="single" w:sz="4" w:color="D9D9D9"/>
               <w:left w:val="single" w:sz="4" w:color="D9D9D9"/>
               <w:bottom w:val="single" w:sz="4" w:color="D9D9D9"/>
               <w:right w:val="single" w:sz="4" w:color="D9D9D9"/>
             </w:tcBorders>
+            <w:shd w:fill="FFFFFF"/>
             <w:tcMar>
-              <w:top w:w="70" w:type="dxa"/>
-              <w:bottom w:w="70" w:type="dxa"/>
+              <w:top w:w="65" w:type="dxa"/>
+              <w:bottom w:w="65" w:type="dxa"/>
               <w:left w:w="90" w:type="dxa"/>
               <w:right w:w="90" w:type="dxa"/>
             </w:tcMar>
@@ -1514,26 +1539,26 @@
             </w:pPr>
             <w:r>
               <w:rPr>
+                <w:color w:val="000000"/>
                 <w:sz w:val="18"/>
               </w:rPr>
-              <w:t>Two pairs</w:t>
+              <w:t>Four teams of three</w:t>
             </w:r>
           </w:p>
         </w:tc>
         <w:tc>
           <w:tcPr>
             <w:tcW w:type="dxa" w:w="2592"/>
-            <w:vAlign w:val="center"/>
-            <w:shd w:fill="FFFFFF"/>
             <w:tcBorders>
               <w:top w:val="single" w:sz="4" w:color="D9D9D9"/>
               <w:left w:val="single" w:sz="4" w:color="D9D9D9"/>
               <w:bottom w:val="single" w:sz="4" w:color="D9D9D9"/>
               <w:right w:val="single" w:sz="4" w:color="D9D9D9"/>
             </w:tcBorders>
+            <w:shd w:fill="FFFFFF"/>
             <w:tcMar>
-              <w:top w:w="70" w:type="dxa"/>
-              <w:bottom w:w="70" w:type="dxa"/>
+              <w:top w:w="65" w:type="dxa"/>
+              <w:bottom w:w="65" w:type="dxa"/>
               <w:left w:w="90" w:type="dxa"/>
               <w:right w:w="90" w:type="dxa"/>
             </w:tcMar>
@@ -1544,26 +1569,26 @@
             </w:pPr>
             <w:r>
               <w:rPr>
+                <w:color w:val="000000"/>
                 <w:sz w:val="18"/>
               </w:rPr>
-              <w:t>One kit per pair</w:t>
+              <w:t>Two teams share each robot</w:t>
             </w:r>
           </w:p>
         </w:tc>
         <w:tc>
           <w:tcPr>
             <w:tcW w:type="dxa" w:w="4709"/>
-            <w:vAlign w:val="center"/>
-            <w:shd w:fill="FFFFFF"/>
             <w:tcBorders>
               <w:top w:val="single" w:sz="4" w:color="D9D9D9"/>
               <w:left w:val="single" w:sz="4" w:color="D9D9D9"/>
               <w:bottom w:val="single" w:sz="4" w:color="D9D9D9"/>
               <w:right w:val="single" w:sz="4" w:color="D9D9D9"/>
             </w:tcBorders>
+            <w:shd w:fill="FFFFFF"/>
             <w:tcMar>
-              <w:top w:w="70" w:type="dxa"/>
-              <w:bottom w:w="70" w:type="dxa"/>
+              <w:top w:w="65" w:type="dxa"/>
+              <w:bottom w:w="65" w:type="dxa"/>
               <w:left w:w="90" w:type="dxa"/>
               <w:right w:w="90" w:type="dxa"/>
             </w:tcMar>
@@ -1574,9 +1599,10 @@
             </w:pPr>
             <w:r>
               <w:rPr>
+                <w:color w:val="000000"/>
                 <w:sz w:val="18"/>
               </w:rPr>
-              <w:t>Best access if enrollment is small</w:t>
+              <w:t>Confirmed class plan</w:t>
             </w:r>
           </w:p>
         </w:tc>
@@ -1588,17 +1614,16 @@
         <w:tc>
           <w:tcPr>
             <w:tcW w:type="dxa" w:w="864"/>
-            <w:vAlign w:val="center"/>
-            <w:shd w:fill="F2F5F6"/>
             <w:tcBorders>
               <w:top w:val="single" w:sz="4" w:color="D9D9D9"/>
               <w:left w:val="single" w:sz="4" w:color="D9D9D9"/>
               <w:bottom w:val="single" w:sz="4" w:color="D9D9D9"/>
               <w:right w:val="single" w:sz="4" w:color="D9D9D9"/>
             </w:tcBorders>
+            <w:shd w:fill="F2F5F6"/>
             <w:tcMar>
-              <w:top w:w="70" w:type="dxa"/>
-              <w:bottom w:w="70" w:type="dxa"/>
+              <w:top w:w="65" w:type="dxa"/>
+              <w:bottom w:w="65" w:type="dxa"/>
               <w:left w:w="90" w:type="dxa"/>
               <w:right w:w="90" w:type="dxa"/>
             </w:tcMar>
@@ -1609,26 +1634,26 @@
             </w:pPr>
             <w:r>
               <w:rPr>
+                <w:color w:val="000000"/>
                 <w:sz w:val="18"/>
               </w:rPr>
-              <w:t>6</w:t>
+              <w:t>4–6</w:t>
             </w:r>
           </w:p>
         </w:tc>
         <w:tc>
           <w:tcPr>
             <w:tcW w:type="dxa" w:w="2016"/>
-            <w:vAlign w:val="center"/>
-            <w:shd w:fill="F2F5F6"/>
             <w:tcBorders>
               <w:top w:val="single" w:sz="4" w:color="D9D9D9"/>
               <w:left w:val="single" w:sz="4" w:color="D9D9D9"/>
               <w:bottom w:val="single" w:sz="4" w:color="D9D9D9"/>
               <w:right w:val="single" w:sz="4" w:color="D9D9D9"/>
             </w:tcBorders>
+            <w:shd w:fill="F2F5F6"/>
             <w:tcMar>
-              <w:top w:w="70" w:type="dxa"/>
-              <w:bottom w:w="70" w:type="dxa"/>
+              <w:top w:w="65" w:type="dxa"/>
+              <w:bottom w:w="65" w:type="dxa"/>
               <w:left w:w="90" w:type="dxa"/>
               <w:right w:w="90" w:type="dxa"/>
             </w:tcMar>
@@ -1639,26 +1664,26 @@
             </w:pPr>
             <w:r>
               <w:rPr>
+                <w:color w:val="000000"/>
                 <w:sz w:val="18"/>
               </w:rPr>
-              <w:t>Two groups of three</w:t>
+              <w:t>Two robot and two build leads</w:t>
             </w:r>
           </w:p>
         </w:tc>
         <w:tc>
           <w:tcPr>
             <w:tcW w:type="dxa" w:w="2592"/>
-            <w:vAlign w:val="center"/>
-            <w:shd w:fill="F2F5F6"/>
             <w:tcBorders>
               <w:top w:val="single" w:sz="4" w:color="D9D9D9"/>
               <w:left w:val="single" w:sz="4" w:color="D9D9D9"/>
               <w:bottom w:val="single" w:sz="4" w:color="D9D9D9"/>
               <w:right w:val="single" w:sz="4" w:color="D9D9D9"/>
             </w:tcBorders>
+            <w:shd w:fill="F2F5F6"/>
             <w:tcMar>
-              <w:top w:w="70" w:type="dxa"/>
-              <w:bottom w:w="70" w:type="dxa"/>
+              <w:top w:w="65" w:type="dxa"/>
+              <w:bottom w:w="65" w:type="dxa"/>
               <w:left w:w="90" w:type="dxa"/>
               <w:right w:w="90" w:type="dxa"/>
             </w:tcMar>
@@ -1669,26 +1694,26 @@
             </w:pPr>
             <w:r>
               <w:rPr>
+                <w:color w:val="000000"/>
                 <w:sz w:val="18"/>
               </w:rPr>
-              <w:t>One kit per group</w:t>
+              <w:t>Additional mentors float</w:t>
             </w:r>
           </w:p>
         </w:tc>
         <w:tc>
           <w:tcPr>
             <w:tcW w:type="dxa" w:w="4709"/>
-            <w:vAlign w:val="center"/>
-            <w:shd w:fill="F2F5F6"/>
             <w:tcBorders>
               <w:top w:val="single" w:sz="4" w:color="D9D9D9"/>
               <w:left w:val="single" w:sz="4" w:color="D9D9D9"/>
               <w:bottom w:val="single" w:sz="4" w:color="D9D9D9"/>
               <w:right w:val="single" w:sz="4" w:color="D9D9D9"/>
             </w:tcBorders>
+            <w:shd w:fill="F2F5F6"/>
             <w:tcMar>
-              <w:top w:w="70" w:type="dxa"/>
-              <w:bottom w:w="70" w:type="dxa"/>
+              <w:top w:w="65" w:type="dxa"/>
+              <w:bottom w:w="65" w:type="dxa"/>
               <w:left w:w="90" w:type="dxa"/>
               <w:right w:w="90" w:type="dxa"/>
             </w:tcMar>
@@ -1699,259 +1724,10 @@
             </w:pPr>
             <w:r>
               <w:rPr>
+                <w:color w:val="000000"/>
                 <w:sz w:val="18"/>
               </w:rPr>
-              <w:t>Rotate programmer, navigator, and test recorder every four minutes</w:t>
-            </w:r>
-          </w:p>
-        </w:tc>
-      </w:tr>
-      <w:tr>
-        <w:trPr>
-          <w:cantSplit/>
-        </w:trPr>
-        <w:tc>
-          <w:tcPr>
-            <w:tcW w:type="dxa" w:w="864"/>
-            <w:vAlign w:val="center"/>
-            <w:shd w:fill="FFFFFF"/>
-            <w:tcBorders>
-              <w:top w:val="single" w:sz="4" w:color="D9D9D9"/>
-              <w:left w:val="single" w:sz="4" w:color="D9D9D9"/>
-              <w:bottom w:val="single" w:sz="4" w:color="D9D9D9"/>
-              <w:right w:val="single" w:sz="4" w:color="D9D9D9"/>
-            </w:tcBorders>
-            <w:tcMar>
-              <w:top w:w="70" w:type="dxa"/>
-              <w:bottom w:w="70" w:type="dxa"/>
-              <w:left w:w="90" w:type="dxa"/>
-              <w:right w:w="90" w:type="dxa"/>
-            </w:tcMar>
-          </w:tcPr>
-          <w:p>
-            <w:pPr>
-              <w:spacing w:after="20" w:line="240" w:lineRule="auto"/>
-            </w:pPr>
-            <w:r>
-              <w:rPr>
-                <w:sz w:val="18"/>
-              </w:rPr>
-              <w:t>8</w:t>
-            </w:r>
-          </w:p>
-        </w:tc>
-        <w:tc>
-          <w:tcPr>
-            <w:tcW w:type="dxa" w:w="2016"/>
-            <w:vAlign w:val="center"/>
-            <w:shd w:fill="FFFFFF"/>
-            <w:tcBorders>
-              <w:top w:val="single" w:sz="4" w:color="D9D9D9"/>
-              <w:left w:val="single" w:sz="4" w:color="D9D9D9"/>
-              <w:bottom w:val="single" w:sz="4" w:color="D9D9D9"/>
-              <w:right w:val="single" w:sz="4" w:color="D9D9D9"/>
-            </w:tcBorders>
-            <w:tcMar>
-              <w:top w:w="70" w:type="dxa"/>
-              <w:bottom w:w="70" w:type="dxa"/>
-              <w:left w:w="90" w:type="dxa"/>
-              <w:right w:w="90" w:type="dxa"/>
-            </w:tcMar>
-          </w:tcPr>
-          <w:p>
-            <w:pPr>
-              <w:spacing w:after="20" w:line="240" w:lineRule="auto"/>
-            </w:pPr>
-            <w:r>
-              <w:rPr>
-                <w:sz w:val="18"/>
-              </w:rPr>
-              <w:t>Four pairs in two pods</w:t>
-            </w:r>
-          </w:p>
-        </w:tc>
-        <w:tc>
-          <w:tcPr>
-            <w:tcW w:type="dxa" w:w="2592"/>
-            <w:vAlign w:val="center"/>
-            <w:shd w:fill="FFFFFF"/>
-            <w:tcBorders>
-              <w:top w:val="single" w:sz="4" w:color="D9D9D9"/>
-              <w:left w:val="single" w:sz="4" w:color="D9D9D9"/>
-              <w:bottom w:val="single" w:sz="4" w:color="D9D9D9"/>
-              <w:right w:val="single" w:sz="4" w:color="D9D9D9"/>
-            </w:tcBorders>
-            <w:tcMar>
-              <w:top w:w="70" w:type="dxa"/>
-              <w:bottom w:w="70" w:type="dxa"/>
-              <w:left w:w="90" w:type="dxa"/>
-              <w:right w:w="90" w:type="dxa"/>
-            </w:tcMar>
-          </w:tcPr>
-          <w:p>
-            <w:pPr>
-              <w:spacing w:after="20" w:line="240" w:lineRule="auto"/>
-            </w:pPr>
-            <w:r>
-              <w:rPr>
-                <w:sz w:val="18"/>
-              </w:rPr>
-              <w:t>Two pairs share each kit</w:t>
-            </w:r>
-          </w:p>
-        </w:tc>
-        <w:tc>
-          <w:tcPr>
-            <w:tcW w:type="dxa" w:w="4709"/>
-            <w:vAlign w:val="center"/>
-            <w:shd w:fill="FFFFFF"/>
-            <w:tcBorders>
-              <w:top w:val="single" w:sz="4" w:color="D9D9D9"/>
-              <w:left w:val="single" w:sz="4" w:color="D9D9D9"/>
-              <w:bottom w:val="single" w:sz="4" w:color="D9D9D9"/>
-              <w:right w:val="single" w:sz="4" w:color="D9D9D9"/>
-            </w:tcBorders>
-            <w:tcMar>
-              <w:top w:w="70" w:type="dxa"/>
-              <w:bottom w:w="70" w:type="dxa"/>
-              <w:left w:w="90" w:type="dxa"/>
-              <w:right w:w="90" w:type="dxa"/>
-            </w:tcMar>
-          </w:tcPr>
-          <w:p>
-            <w:pPr>
-              <w:spacing w:after="20" w:line="240" w:lineRule="auto"/>
-            </w:pPr>
-            <w:r>
-              <w:rPr>
-                <w:sz w:val="18"/>
-              </w:rPr>
-              <w:t>Recommended upper target for the first pilot</w:t>
-            </w:r>
-          </w:p>
-        </w:tc>
-      </w:tr>
-      <w:tr>
-        <w:trPr>
-          <w:cantSplit/>
-        </w:trPr>
-        <w:tc>
-          <w:tcPr>
-            <w:tcW w:type="dxa" w:w="864"/>
-            <w:vAlign w:val="center"/>
-            <w:shd w:fill="F2F5F6"/>
-            <w:tcBorders>
-              <w:top w:val="single" w:sz="4" w:color="D9D9D9"/>
-              <w:left w:val="single" w:sz="4" w:color="D9D9D9"/>
-              <w:bottom w:val="single" w:sz="4" w:color="D9D9D9"/>
-              <w:right w:val="single" w:sz="4" w:color="D9D9D9"/>
-            </w:tcBorders>
-            <w:tcMar>
-              <w:top w:w="70" w:type="dxa"/>
-              <w:bottom w:w="70" w:type="dxa"/>
-              <w:left w:w="90" w:type="dxa"/>
-              <w:right w:w="90" w:type="dxa"/>
-            </w:tcMar>
-          </w:tcPr>
-          <w:p>
-            <w:pPr>
-              <w:spacing w:after="20" w:line="240" w:lineRule="auto"/>
-            </w:pPr>
-            <w:r>
-              <w:rPr>
-                <w:sz w:val="18"/>
-              </w:rPr>
-              <w:t>9–12</w:t>
-            </w:r>
-          </w:p>
-        </w:tc>
-        <w:tc>
-          <w:tcPr>
-            <w:tcW w:type="dxa" w:w="2016"/>
-            <w:vAlign w:val="center"/>
-            <w:shd w:fill="F2F5F6"/>
-            <w:tcBorders>
-              <w:top w:val="single" w:sz="4" w:color="D9D9D9"/>
-              <w:left w:val="single" w:sz="4" w:color="D9D9D9"/>
-              <w:bottom w:val="single" w:sz="4" w:color="D9D9D9"/>
-              <w:right w:val="single" w:sz="4" w:color="D9D9D9"/>
-            </w:tcBorders>
-            <w:tcMar>
-              <w:top w:w="70" w:type="dxa"/>
-              <w:bottom w:w="70" w:type="dxa"/>
-              <w:left w:w="90" w:type="dxa"/>
-              <w:right w:w="90" w:type="dxa"/>
-            </w:tcMar>
-          </w:tcPr>
-          <w:p>
-            <w:pPr>
-              <w:spacing w:after="20" w:line="240" w:lineRule="auto"/>
-            </w:pPr>
-            <w:r>
-              <w:rPr>
-                <w:sz w:val="18"/>
-              </w:rPr>
-              <w:t>Additional pairs</w:t>
-            </w:r>
-          </w:p>
-        </w:tc>
-        <w:tc>
-          <w:tcPr>
-            <w:tcW w:type="dxa" w:w="2592"/>
-            <w:vAlign w:val="center"/>
-            <w:shd w:fill="F2F5F6"/>
-            <w:tcBorders>
-              <w:top w:val="single" w:sz="4" w:color="D9D9D9"/>
-              <w:left w:val="single" w:sz="4" w:color="D9D9D9"/>
-              <w:bottom w:val="single" w:sz="4" w:color="D9D9D9"/>
-              <w:right w:val="single" w:sz="4" w:color="D9D9D9"/>
-            </w:tcBorders>
-            <w:tcMar>
-              <w:top w:w="70" w:type="dxa"/>
-              <w:bottom w:w="70" w:type="dxa"/>
-              <w:left w:w="90" w:type="dxa"/>
-              <w:right w:w="90" w:type="dxa"/>
-            </w:tcMar>
-          </w:tcPr>
-          <w:p>
-            <w:pPr>
-              <w:spacing w:after="20" w:line="240" w:lineRule="auto"/>
-            </w:pPr>
-            <w:r>
-              <w:rPr>
-                <w:sz w:val="18"/>
-              </w:rPr>
-              <w:t>Too little access with the core schedule</w:t>
-            </w:r>
-          </w:p>
-        </w:tc>
-        <w:tc>
-          <w:tcPr>
-            <w:tcW w:type="dxa" w:w="4709"/>
-            <w:vAlign w:val="center"/>
-            <w:shd w:fill="F2F5F6"/>
-            <w:tcBorders>
-              <w:top w:val="single" w:sz="4" w:color="D9D9D9"/>
-              <w:left w:val="single" w:sz="4" w:color="D9D9D9"/>
-              <w:bottom w:val="single" w:sz="4" w:color="D9D9D9"/>
-              <w:right w:val="single" w:sz="4" w:color="D9D9D9"/>
-            </w:tcBorders>
-            <w:tcMar>
-              <w:top w:w="70" w:type="dxa"/>
-              <w:bottom w:w="70" w:type="dxa"/>
-              <w:left w:w="90" w:type="dxa"/>
-              <w:right w:w="90" w:type="dxa"/>
-            </w:tcMar>
-          </w:tcPr>
-          <w:p>
-            <w:pPr>
-              <w:spacing w:after="20" w:line="240" w:lineRule="auto"/>
-            </w:pPr>
-            <w:r>
-              <w:rPr>
-                <w:sz w:val="18"/>
-              </w:rPr>
-              <w:t>Split into cohorts or secure a third kit and staffing before enrollment</w:t>
+              <w:t>Plus an adult lead</w:t>
             </w:r>
           </w:p>
         </w:tc>
@@ -1972,7 +1748,7 @@
     </w:p>
     <w:p>
       <w:r>
-        <w:t>Assign one adult program lead who remains responsible for the session and follows the YMCA’s supervision and pickup procedures. Use at least two prepared high school mentors, one per kit pod; four mentors, one per pair, are preferable. This is an instructional staffing recommendation, not a substitute for YMCA staffing requirements. Identify a backup mentor before the pilot.</w:t>
+        <w:t>Assign one adult program lead who follows YMCA supervision and pickup procedures. Use the confirmed 4–6 student instructors: two lead robot stations and two lead build tables. Additional mentors help with transitions and individual support. Identify a backup before class.</w:t>
       </w:r>
     </w:p>
     <w:p>
@@ -1985,7 +1761,7 @@
     </w:p>
     <w:p>
       <w:r>
-        <w:t>Prefer one laptop and keyboard per pair, with one hub connected per kit at a time. A two-laptop version works by leaving each device at its robot station and using printed code tracing, design, and measurement tasks elsewhere. Do not count phones or untested tablets as working Python stations. Check the actual device and the current official app requirements [2].</w:t>
+        <w:t>Bring the four available laptops. Leave two at the robot stations and use two for build instructions or reference photos; those two do not connect to the hubs. Printed build cards support the same hands-on station with only two laptops. Test the actual devices, Python, connection and save/export workflow before class [2].</w:t>
       </w:r>
     </w:p>
     <w:p>
@@ -2029,7 +1805,7 @@
     </w:p>
     <w:p>
       <w:r>
-        <w:t>Illustrative Wednesday schedule for 2026. These dates are not booked. Confirm school and YMCA calendars, the November 11 holiday, and room availability before advertising.</w:t>
+        <w:t>Session dates remain unconfirmed. The earlier October 21 proposal start has passed. Agree eight actual dates and a make-up plan with the YMCA before distributing a calendar.</w:t>
       </w:r>
     </w:p>
     <w:tbl>
@@ -2053,16 +1829,16 @@
           <w:tcPr>
             <w:tcW w:type="dxa" w:w="792"/>
             <w:vAlign w:val="center"/>
-            <w:shd w:fill="243E50"/>
             <w:tcBorders>
               <w:top w:val="single" w:sz="4" w:color="D9D9D9"/>
               <w:left w:val="single" w:sz="4" w:color="D9D9D9"/>
               <w:bottom w:val="single" w:sz="4" w:color="D9D9D9"/>
               <w:right w:val="single" w:sz="4" w:color="D9D9D9"/>
             </w:tcBorders>
+            <w:shd w:fill="243E50"/>
             <w:tcMar>
-              <w:top w:w="70" w:type="dxa"/>
-              <w:bottom w:w="70" w:type="dxa"/>
+              <w:top w:w="65" w:type="dxa"/>
+              <w:bottom w:w="65" w:type="dxa"/>
               <w:left w:w="90" w:type="dxa"/>
               <w:right w:w="90" w:type="dxa"/>
             </w:tcMar>
@@ -2085,16 +1861,16 @@
           <w:tcPr>
             <w:tcW w:type="dxa" w:w="2232"/>
             <w:vAlign w:val="center"/>
-            <w:shd w:fill="243E50"/>
             <w:tcBorders>
               <w:top w:val="single" w:sz="4" w:color="D9D9D9"/>
               <w:left w:val="single" w:sz="4" w:color="D9D9D9"/>
               <w:bottom w:val="single" w:sz="4" w:color="D9D9D9"/>
               <w:right w:val="single" w:sz="4" w:color="D9D9D9"/>
             </w:tcBorders>
+            <w:shd w:fill="243E50"/>
             <w:tcMar>
-              <w:top w:w="70" w:type="dxa"/>
-              <w:bottom w:w="70" w:type="dxa"/>
+              <w:top w:w="65" w:type="dxa"/>
+              <w:bottom w:w="65" w:type="dxa"/>
               <w:left w:w="90" w:type="dxa"/>
               <w:right w:w="90" w:type="dxa"/>
             </w:tcMar>
@@ -2105,11 +1881,10 @@
             </w:pPr>
             <w:r>
               <w:rPr>
-                <w:b/>
                 <w:color w:val="FFFFFF"/>
                 <w:sz w:val="18"/>
               </w:rPr>
-              <w:t>Proposed date</w:t>
+              <w:t>Confirmed date</w:t>
             </w:r>
           </w:p>
         </w:tc>
@@ -2117,16 +1892,16 @@
           <w:tcPr>
             <w:tcW w:type="dxa" w:w="7157"/>
             <w:vAlign w:val="center"/>
-            <w:shd w:fill="243E50"/>
             <w:tcBorders>
               <w:top w:val="single" w:sz="4" w:color="D9D9D9"/>
               <w:left w:val="single" w:sz="4" w:color="D9D9D9"/>
               <w:bottom w:val="single" w:sz="4" w:color="D9D9D9"/>
               <w:right w:val="single" w:sz="4" w:color="D9D9D9"/>
             </w:tcBorders>
+            <w:shd w:fill="243E50"/>
             <w:tcMar>
-              <w:top w:w="70" w:type="dxa"/>
-              <w:bottom w:w="70" w:type="dxa"/>
+              <w:top w:w="65" w:type="dxa"/>
+              <w:bottom w:w="65" w:type="dxa"/>
               <w:left w:w="90" w:type="dxa"/>
               <w:right w:w="90" w:type="dxa"/>
             </w:tcMar>
@@ -2154,16 +1929,16 @@
           <w:tcPr>
             <w:tcW w:type="dxa" w:w="792"/>
             <w:vAlign w:val="center"/>
-            <w:shd w:fill="FFFFFF"/>
             <w:tcBorders>
               <w:top w:val="single" w:sz="4" w:color="D9D9D9"/>
               <w:left w:val="single" w:sz="4" w:color="D9D9D9"/>
               <w:bottom w:val="single" w:sz="4" w:color="D9D9D9"/>
               <w:right w:val="single" w:sz="4" w:color="D9D9D9"/>
             </w:tcBorders>
+            <w:shd w:fill="FFFFFF"/>
             <w:tcMar>
-              <w:top w:w="70" w:type="dxa"/>
-              <w:bottom w:w="70" w:type="dxa"/>
+              <w:top w:w="65" w:type="dxa"/>
+              <w:bottom w:w="65" w:type="dxa"/>
               <w:left w:w="90" w:type="dxa"/>
               <w:right w:w="90" w:type="dxa"/>
             </w:tcMar>
@@ -2174,6 +1949,7 @@
             </w:pPr>
             <w:r>
               <w:rPr>
+                <w:color w:val="000000"/>
                 <w:sz w:val="18"/>
               </w:rPr>
               <w:t>1</w:t>
@@ -2184,16 +1960,16 @@
           <w:tcPr>
             <w:tcW w:type="dxa" w:w="2232"/>
             <w:vAlign w:val="center"/>
-            <w:shd w:fill="FFFFFF"/>
             <w:tcBorders>
               <w:top w:val="single" w:sz="4" w:color="D9D9D9"/>
               <w:left w:val="single" w:sz="4" w:color="D9D9D9"/>
               <w:bottom w:val="single" w:sz="4" w:color="D9D9D9"/>
               <w:right w:val="single" w:sz="4" w:color="D9D9D9"/>
             </w:tcBorders>
+            <w:shd w:fill="FFFFFF"/>
             <w:tcMar>
-              <w:top w:w="70" w:type="dxa"/>
-              <w:bottom w:w="70" w:type="dxa"/>
+              <w:top w:w="65" w:type="dxa"/>
+              <w:bottom w:w="65" w:type="dxa"/>
               <w:left w:w="90" w:type="dxa"/>
               <w:right w:w="90" w:type="dxa"/>
             </w:tcMar>
@@ -2204,9 +1980,10 @@
             </w:pPr>
             <w:r>
               <w:rPr>
+                <w:color w:val="000000"/>
                 <w:sz w:val="18"/>
               </w:rPr>
-              <w:t>October 21</w:t>
+              <w:t>To be agreed</w:t>
             </w:r>
           </w:p>
         </w:tc>
@@ -2214,16 +1991,16 @@
           <w:tcPr>
             <w:tcW w:type="dxa" w:w="7157"/>
             <w:vAlign w:val="center"/>
-            <w:shd w:fill="FFFFFF"/>
             <w:tcBorders>
               <w:top w:val="single" w:sz="4" w:color="D9D9D9"/>
               <w:left w:val="single" w:sz="4" w:color="D9D9D9"/>
               <w:bottom w:val="single" w:sz="4" w:color="D9D9D9"/>
               <w:right w:val="single" w:sz="4" w:color="D9D9D9"/>
             </w:tcBorders>
+            <w:shd w:fill="FFFFFF"/>
             <w:tcMar>
-              <w:top w:w="70" w:type="dxa"/>
-              <w:bottom w:w="70" w:type="dxa"/>
+              <w:top w:w="65" w:type="dxa"/>
+              <w:bottom w:w="65" w:type="dxa"/>
               <w:left w:w="90" w:type="dxa"/>
               <w:right w:w="90" w:type="dxa"/>
             </w:tcMar>
@@ -2234,6 +2011,7 @@
             </w:pPr>
             <w:r>
               <w:rPr>
+                <w:color w:val="000000"/>
                 <w:sz w:val="18"/>
               </w:rPr>
               <w:t>Meet your robot</w:t>
@@ -2249,16 +2027,16 @@
           <w:tcPr>
             <w:tcW w:type="dxa" w:w="792"/>
             <w:vAlign w:val="center"/>
-            <w:shd w:fill="F2F5F6"/>
             <w:tcBorders>
               <w:top w:val="single" w:sz="4" w:color="D9D9D9"/>
               <w:left w:val="single" w:sz="4" w:color="D9D9D9"/>
               <w:bottom w:val="single" w:sz="4" w:color="D9D9D9"/>
               <w:right w:val="single" w:sz="4" w:color="D9D9D9"/>
             </w:tcBorders>
+            <w:shd w:fill="F2F5F6"/>
             <w:tcMar>
-              <w:top w:w="70" w:type="dxa"/>
-              <w:bottom w:w="70" w:type="dxa"/>
+              <w:top w:w="65" w:type="dxa"/>
+              <w:bottom w:w="65" w:type="dxa"/>
               <w:left w:w="90" w:type="dxa"/>
               <w:right w:w="90" w:type="dxa"/>
             </w:tcMar>
@@ -2269,6 +2047,7 @@
             </w:pPr>
             <w:r>
               <w:rPr>
+                <w:color w:val="000000"/>
                 <w:sz w:val="18"/>
               </w:rPr>
               <w:t>2</w:t>
@@ -2279,16 +2058,16 @@
           <w:tcPr>
             <w:tcW w:type="dxa" w:w="2232"/>
             <w:vAlign w:val="center"/>
-            <w:shd w:fill="F2F5F6"/>
             <w:tcBorders>
               <w:top w:val="single" w:sz="4" w:color="D9D9D9"/>
               <w:left w:val="single" w:sz="4" w:color="D9D9D9"/>
               <w:bottom w:val="single" w:sz="4" w:color="D9D9D9"/>
               <w:right w:val="single" w:sz="4" w:color="D9D9D9"/>
             </w:tcBorders>
+            <w:shd w:fill="F2F5F6"/>
             <w:tcMar>
-              <w:top w:w="70" w:type="dxa"/>
-              <w:bottom w:w="70" w:type="dxa"/>
+              <w:top w:w="65" w:type="dxa"/>
+              <w:bottom w:w="65" w:type="dxa"/>
               <w:left w:w="90" w:type="dxa"/>
               <w:right w:w="90" w:type="dxa"/>
             </w:tcMar>
@@ -2299,9 +2078,10 @@
             </w:pPr>
             <w:r>
               <w:rPr>
+                <w:color w:val="000000"/>
                 <w:sz w:val="18"/>
               </w:rPr>
-              <w:t>October 28</w:t>
+              <w:t>To be agreed</w:t>
             </w:r>
           </w:p>
         </w:tc>
@@ -2309,16 +2089,16 @@
           <w:tcPr>
             <w:tcW w:type="dxa" w:w="7157"/>
             <w:vAlign w:val="center"/>
-            <w:shd w:fill="F2F5F6"/>
             <w:tcBorders>
               <w:top w:val="single" w:sz="4" w:color="D9D9D9"/>
               <w:left w:val="single" w:sz="4" w:color="D9D9D9"/>
               <w:bottom w:val="single" w:sz="4" w:color="D9D9D9"/>
               <w:right w:val="single" w:sz="4" w:color="D9D9D9"/>
             </w:tcBorders>
+            <w:shd w:fill="F2F5F6"/>
             <w:tcMar>
-              <w:top w:w="70" w:type="dxa"/>
-              <w:bottom w:w="70" w:type="dxa"/>
+              <w:top w:w="65" w:type="dxa"/>
+              <w:bottom w:w="65" w:type="dxa"/>
               <w:left w:w="90" w:type="dxa"/>
               <w:right w:w="90" w:type="dxa"/>
             </w:tcMar>
@@ -2329,6 +2109,7 @@
             </w:pPr>
             <w:r>
               <w:rPr>
+                <w:color w:val="000000"/>
                 <w:sz w:val="18"/>
               </w:rPr>
               <w:t>Delivery to a target</w:t>
@@ -2344,16 +2125,16 @@
           <w:tcPr>
             <w:tcW w:type="dxa" w:w="792"/>
             <w:vAlign w:val="center"/>
-            <w:shd w:fill="FFFFFF"/>
             <w:tcBorders>
               <w:top w:val="single" w:sz="4" w:color="D9D9D9"/>
               <w:left w:val="single" w:sz="4" w:color="D9D9D9"/>
               <w:bottom w:val="single" w:sz="4" w:color="D9D9D9"/>
               <w:right w:val="single" w:sz="4" w:color="D9D9D9"/>
             </w:tcBorders>
+            <w:shd w:fill="FFFFFF"/>
             <w:tcMar>
-              <w:top w:w="70" w:type="dxa"/>
-              <w:bottom w:w="70" w:type="dxa"/>
+              <w:top w:w="65" w:type="dxa"/>
+              <w:bottom w:w="65" w:type="dxa"/>
               <w:left w:w="90" w:type="dxa"/>
               <w:right w:w="90" w:type="dxa"/>
             </w:tcMar>
@@ -2364,6 +2145,7 @@
             </w:pPr>
             <w:r>
               <w:rPr>
+                <w:color w:val="000000"/>
                 <w:sz w:val="18"/>
               </w:rPr>
               <w:t>3</w:t>
@@ -2374,16 +2156,16 @@
           <w:tcPr>
             <w:tcW w:type="dxa" w:w="2232"/>
             <w:vAlign w:val="center"/>
-            <w:shd w:fill="FFFFFF"/>
             <w:tcBorders>
               <w:top w:val="single" w:sz="4" w:color="D9D9D9"/>
               <w:left w:val="single" w:sz="4" w:color="D9D9D9"/>
               <w:bottom w:val="single" w:sz="4" w:color="D9D9D9"/>
               <w:right w:val="single" w:sz="4" w:color="D9D9D9"/>
             </w:tcBorders>
+            <w:shd w:fill="FFFFFF"/>
             <w:tcMar>
-              <w:top w:w="70" w:type="dxa"/>
-              <w:bottom w:w="70" w:type="dxa"/>
+              <w:top w:w="65" w:type="dxa"/>
+              <w:bottom w:w="65" w:type="dxa"/>
               <w:left w:w="90" w:type="dxa"/>
               <w:right w:w="90" w:type="dxa"/>
             </w:tcMar>
@@ -2394,9 +2176,10 @@
             </w:pPr>
             <w:r>
               <w:rPr>
+                <w:color w:val="000000"/>
                 <w:sz w:val="18"/>
               </w:rPr>
-              <w:t>November 4</w:t>
+              <w:t>To be agreed</w:t>
             </w:r>
           </w:p>
         </w:tc>
@@ -2404,16 +2187,16 @@
           <w:tcPr>
             <w:tcW w:type="dxa" w:w="7157"/>
             <w:vAlign w:val="center"/>
-            <w:shd w:fill="FFFFFF"/>
             <w:tcBorders>
               <w:top w:val="single" w:sz="4" w:color="D9D9D9"/>
               <w:left w:val="single" w:sz="4" w:color="D9D9D9"/>
               <w:bottom w:val="single" w:sz="4" w:color="D9D9D9"/>
               <w:right w:val="single" w:sz="4" w:color="D9D9D9"/>
             </w:tcBorders>
+            <w:shd w:fill="FFFFFF"/>
             <w:tcMar>
-              <w:top w:w="70" w:type="dxa"/>
-              <w:bottom w:w="70" w:type="dxa"/>
+              <w:top w:w="65" w:type="dxa"/>
+              <w:bottom w:w="65" w:type="dxa"/>
               <w:left w:w="90" w:type="dxa"/>
               <w:right w:w="90" w:type="dxa"/>
             </w:tcMar>
@@ -2424,6 +2207,7 @@
             </w:pPr>
             <w:r>
               <w:rPr>
+                <w:color w:val="000000"/>
                 <w:sz w:val="18"/>
               </w:rPr>
               <w:t>Robot dance studio</w:t>
@@ -2439,16 +2223,16 @@
           <w:tcPr>
             <w:tcW w:type="dxa" w:w="792"/>
             <w:vAlign w:val="center"/>
-            <w:shd w:fill="F2F5F6"/>
             <w:tcBorders>
               <w:top w:val="single" w:sz="4" w:color="D9D9D9"/>
               <w:left w:val="single" w:sz="4" w:color="D9D9D9"/>
               <w:bottom w:val="single" w:sz="4" w:color="D9D9D9"/>
               <w:right w:val="single" w:sz="4" w:color="D9D9D9"/>
             </w:tcBorders>
+            <w:shd w:fill="F2F5F6"/>
             <w:tcMar>
-              <w:top w:w="70" w:type="dxa"/>
-              <w:bottom w:w="70" w:type="dxa"/>
+              <w:top w:w="65" w:type="dxa"/>
+              <w:bottom w:w="65" w:type="dxa"/>
               <w:left w:w="90" w:type="dxa"/>
               <w:right w:w="90" w:type="dxa"/>
             </w:tcMar>
@@ -2459,6 +2243,7 @@
             </w:pPr>
             <w:r>
               <w:rPr>
+                <w:color w:val="000000"/>
                 <w:sz w:val="18"/>
               </w:rPr>
               <w:t>4</w:t>
@@ -2469,16 +2254,16 @@
           <w:tcPr>
             <w:tcW w:type="dxa" w:w="2232"/>
             <w:vAlign w:val="center"/>
-            <w:shd w:fill="F2F5F6"/>
             <w:tcBorders>
               <w:top w:val="single" w:sz="4" w:color="D9D9D9"/>
               <w:left w:val="single" w:sz="4" w:color="D9D9D9"/>
               <w:bottom w:val="single" w:sz="4" w:color="D9D9D9"/>
               <w:right w:val="single" w:sz="4" w:color="D9D9D9"/>
             </w:tcBorders>
+            <w:shd w:fill="F2F5F6"/>
             <w:tcMar>
-              <w:top w:w="70" w:type="dxa"/>
-              <w:bottom w:w="70" w:type="dxa"/>
+              <w:top w:w="65" w:type="dxa"/>
+              <w:bottom w:w="65" w:type="dxa"/>
               <w:left w:w="90" w:type="dxa"/>
               <w:right w:w="90" w:type="dxa"/>
             </w:tcMar>
@@ -2489,9 +2274,10 @@
             </w:pPr>
             <w:r>
               <w:rPr>
+                <w:color w:val="000000"/>
                 <w:sz w:val="18"/>
               </w:rPr>
-              <w:t>November 11</w:t>
+              <w:t>To be agreed</w:t>
             </w:r>
           </w:p>
         </w:tc>
@@ -2499,16 +2285,16 @@
           <w:tcPr>
             <w:tcW w:type="dxa" w:w="7157"/>
             <w:vAlign w:val="center"/>
-            <w:shd w:fill="F2F5F6"/>
             <w:tcBorders>
               <w:top w:val="single" w:sz="4" w:color="D9D9D9"/>
               <w:left w:val="single" w:sz="4" w:color="D9D9D9"/>
               <w:bottom w:val="single" w:sz="4" w:color="D9D9D9"/>
               <w:right w:val="single" w:sz="4" w:color="D9D9D9"/>
             </w:tcBorders>
+            <w:shd w:fill="F2F5F6"/>
             <w:tcMar>
-              <w:top w:w="70" w:type="dxa"/>
-              <w:bottom w:w="70" w:type="dxa"/>
+              <w:top w:w="65" w:type="dxa"/>
+              <w:bottom w:w="65" w:type="dxa"/>
               <w:left w:w="90" w:type="dxa"/>
               <w:right w:w="90" w:type="dxa"/>
             </w:tcMar>
@@ -2519,6 +2305,7 @@
             </w:pPr>
             <w:r>
               <w:rPr>
+                <w:color w:val="000000"/>
                 <w:sz w:val="18"/>
               </w:rPr>
               <w:t>Parking assistant</w:t>
@@ -2534,16 +2321,16 @@
           <w:tcPr>
             <w:tcW w:type="dxa" w:w="792"/>
             <w:vAlign w:val="center"/>
-            <w:shd w:fill="FFFFFF"/>
             <w:tcBorders>
               <w:top w:val="single" w:sz="4" w:color="D9D9D9"/>
               <w:left w:val="single" w:sz="4" w:color="D9D9D9"/>
               <w:bottom w:val="single" w:sz="4" w:color="D9D9D9"/>
               <w:right w:val="single" w:sz="4" w:color="D9D9D9"/>
             </w:tcBorders>
+            <w:shd w:fill="FFFFFF"/>
             <w:tcMar>
-              <w:top w:w="70" w:type="dxa"/>
-              <w:bottom w:w="70" w:type="dxa"/>
+              <w:top w:w="65" w:type="dxa"/>
+              <w:bottom w:w="65" w:type="dxa"/>
               <w:left w:w="90" w:type="dxa"/>
               <w:right w:w="90" w:type="dxa"/>
             </w:tcMar>
@@ -2554,6 +2341,7 @@
             </w:pPr>
             <w:r>
               <w:rPr>
+                <w:color w:val="000000"/>
                 <w:sz w:val="18"/>
               </w:rPr>
               <w:t>5</w:t>
@@ -2564,16 +2352,16 @@
           <w:tcPr>
             <w:tcW w:type="dxa" w:w="2232"/>
             <w:vAlign w:val="center"/>
-            <w:shd w:fill="FFFFFF"/>
             <w:tcBorders>
               <w:top w:val="single" w:sz="4" w:color="D9D9D9"/>
               <w:left w:val="single" w:sz="4" w:color="D9D9D9"/>
               <w:bottom w:val="single" w:sz="4" w:color="D9D9D9"/>
               <w:right w:val="single" w:sz="4" w:color="D9D9D9"/>
             </w:tcBorders>
+            <w:shd w:fill="FFFFFF"/>
             <w:tcMar>
-              <w:top w:w="70" w:type="dxa"/>
-              <w:bottom w:w="70" w:type="dxa"/>
+              <w:top w:w="65" w:type="dxa"/>
+              <w:bottom w:w="65" w:type="dxa"/>
               <w:left w:w="90" w:type="dxa"/>
               <w:right w:w="90" w:type="dxa"/>
             </w:tcMar>
@@ -2584,9 +2372,10 @@
             </w:pPr>
             <w:r>
               <w:rPr>
+                <w:color w:val="000000"/>
                 <w:sz w:val="18"/>
               </w:rPr>
-              <w:t>November 18</w:t>
+              <w:t>To be agreed</w:t>
             </w:r>
           </w:p>
         </w:tc>
@@ -2594,16 +2383,16 @@
           <w:tcPr>
             <w:tcW w:type="dxa" w:w="7157"/>
             <w:vAlign w:val="center"/>
-            <w:shd w:fill="FFFFFF"/>
             <w:tcBorders>
               <w:top w:val="single" w:sz="4" w:color="D9D9D9"/>
               <w:left w:val="single" w:sz="4" w:color="D9D9D9"/>
               <w:bottom w:val="single" w:sz="4" w:color="D9D9D9"/>
               <w:right w:val="single" w:sz="4" w:color="D9D9D9"/>
             </w:tcBorders>
+            <w:shd w:fill="FFFFFF"/>
             <w:tcMar>
-              <w:top w:w="70" w:type="dxa"/>
-              <w:bottom w:w="70" w:type="dxa"/>
+              <w:top w:w="65" w:type="dxa"/>
+              <w:bottom w:w="65" w:type="dxa"/>
               <w:left w:w="90" w:type="dxa"/>
               <w:right w:w="90" w:type="dxa"/>
             </w:tcMar>
@@ -2614,6 +2403,7 @@
             </w:pPr>
             <w:r>
               <w:rPr>
+                <w:color w:val="000000"/>
                 <w:sz w:val="18"/>
               </w:rPr>
               <w:t>The floor tells the robot</w:t>
@@ -2629,16 +2419,16 @@
           <w:tcPr>
             <w:tcW w:type="dxa" w:w="792"/>
             <w:vAlign w:val="center"/>
-            <w:shd w:fill="F2F5F6"/>
             <w:tcBorders>
               <w:top w:val="single" w:sz="4" w:color="D9D9D9"/>
               <w:left w:val="single" w:sz="4" w:color="D9D9D9"/>
               <w:bottom w:val="single" w:sz="4" w:color="D9D9D9"/>
               <w:right w:val="single" w:sz="4" w:color="D9D9D9"/>
             </w:tcBorders>
+            <w:shd w:fill="F2F5F6"/>
             <w:tcMar>
-              <w:top w:w="70" w:type="dxa"/>
-              <w:bottom w:w="70" w:type="dxa"/>
+              <w:top w:w="65" w:type="dxa"/>
+              <w:bottom w:w="65" w:type="dxa"/>
               <w:left w:w="90" w:type="dxa"/>
               <w:right w:w="90" w:type="dxa"/>
             </w:tcMar>
@@ -2649,6 +2439,7 @@
             </w:pPr>
             <w:r>
               <w:rPr>
+                <w:color w:val="000000"/>
                 <w:sz w:val="18"/>
               </w:rPr>
               <w:t>6</w:t>
@@ -2659,16 +2450,16 @@
           <w:tcPr>
             <w:tcW w:type="dxa" w:w="2232"/>
             <w:vAlign w:val="center"/>
-            <w:shd w:fill="F2F5F6"/>
             <w:tcBorders>
               <w:top w:val="single" w:sz="4" w:color="D9D9D9"/>
               <w:left w:val="single" w:sz="4" w:color="D9D9D9"/>
               <w:bottom w:val="single" w:sz="4" w:color="D9D9D9"/>
               <w:right w:val="single" w:sz="4" w:color="D9D9D9"/>
             </w:tcBorders>
+            <w:shd w:fill="F2F5F6"/>
             <w:tcMar>
-              <w:top w:w="70" w:type="dxa"/>
-              <w:bottom w:w="70" w:type="dxa"/>
+              <w:top w:w="65" w:type="dxa"/>
+              <w:bottom w:w="65" w:type="dxa"/>
               <w:left w:w="90" w:type="dxa"/>
               <w:right w:w="90" w:type="dxa"/>
             </w:tcMar>
@@ -2679,9 +2470,10 @@
             </w:pPr>
             <w:r>
               <w:rPr>
+                <w:color w:val="000000"/>
                 <w:sz w:val="18"/>
               </w:rPr>
-              <w:t>December 2</w:t>
+              <w:t>To be agreed</w:t>
             </w:r>
           </w:p>
         </w:tc>
@@ -2689,16 +2481,16 @@
           <w:tcPr>
             <w:tcW w:type="dxa" w:w="7157"/>
             <w:vAlign w:val="center"/>
-            <w:shd w:fill="F2F5F6"/>
             <w:tcBorders>
               <w:top w:val="single" w:sz="4" w:color="D9D9D9"/>
               <w:left w:val="single" w:sz="4" w:color="D9D9D9"/>
               <w:bottom w:val="single" w:sz="4" w:color="D9D9D9"/>
               <w:right w:val="single" w:sz="4" w:color="D9D9D9"/>
             </w:tcBorders>
+            <w:shd w:fill="F2F5F6"/>
             <w:tcMar>
-              <w:top w:w="70" w:type="dxa"/>
-              <w:bottom w:w="70" w:type="dxa"/>
+              <w:top w:w="65" w:type="dxa"/>
+              <w:bottom w:w="65" w:type="dxa"/>
               <w:left w:w="90" w:type="dxa"/>
               <w:right w:w="90" w:type="dxa"/>
             </w:tcMar>
@@ -2709,6 +2501,7 @@
             </w:pPr>
             <w:r>
               <w:rPr>
+                <w:color w:val="000000"/>
                 <w:sz w:val="18"/>
               </w:rPr>
               <w:t>A rescue attachment</w:t>
@@ -2724,16 +2517,16 @@
           <w:tcPr>
             <w:tcW w:type="dxa" w:w="792"/>
             <w:vAlign w:val="center"/>
-            <w:shd w:fill="FFFFFF"/>
             <w:tcBorders>
               <w:top w:val="single" w:sz="4" w:color="D9D9D9"/>
               <w:left w:val="single" w:sz="4" w:color="D9D9D9"/>
               <w:bottom w:val="single" w:sz="4" w:color="D9D9D9"/>
               <w:right w:val="single" w:sz="4" w:color="D9D9D9"/>
             </w:tcBorders>
+            <w:shd w:fill="FFFFFF"/>
             <w:tcMar>
-              <w:top w:w="70" w:type="dxa"/>
-              <w:bottom w:w="70" w:type="dxa"/>
+              <w:top w:w="65" w:type="dxa"/>
+              <w:bottom w:w="65" w:type="dxa"/>
               <w:left w:w="90" w:type="dxa"/>
               <w:right w:w="90" w:type="dxa"/>
             </w:tcMar>
@@ -2744,6 +2537,7 @@
             </w:pPr>
             <w:r>
               <w:rPr>
+                <w:color w:val="000000"/>
                 <w:sz w:val="18"/>
               </w:rPr>
               <w:t>7</w:t>
@@ -2754,16 +2548,16 @@
           <w:tcPr>
             <w:tcW w:type="dxa" w:w="2232"/>
             <w:vAlign w:val="center"/>
-            <w:shd w:fill="FFFFFF"/>
             <w:tcBorders>
               <w:top w:val="single" w:sz="4" w:color="D9D9D9"/>
               <w:left w:val="single" w:sz="4" w:color="D9D9D9"/>
               <w:bottom w:val="single" w:sz="4" w:color="D9D9D9"/>
               <w:right w:val="single" w:sz="4" w:color="D9D9D9"/>
             </w:tcBorders>
+            <w:shd w:fill="FFFFFF"/>
             <w:tcMar>
-              <w:top w:w="70" w:type="dxa"/>
-              <w:bottom w:w="70" w:type="dxa"/>
+              <w:top w:w="65" w:type="dxa"/>
+              <w:bottom w:w="65" w:type="dxa"/>
               <w:left w:w="90" w:type="dxa"/>
               <w:right w:w="90" w:type="dxa"/>
             </w:tcMar>
@@ -2774,9 +2568,10 @@
             </w:pPr>
             <w:r>
               <w:rPr>
+                <w:color w:val="000000"/>
                 <w:sz w:val="18"/>
               </w:rPr>
-              <w:t>December 9</w:t>
+              <w:t>To be agreed</w:t>
             </w:r>
           </w:p>
         </w:tc>
@@ -2784,16 +2579,16 @@
           <w:tcPr>
             <w:tcW w:type="dxa" w:w="7157"/>
             <w:vAlign w:val="center"/>
-            <w:shd w:fill="FFFFFF"/>
             <w:tcBorders>
               <w:top w:val="single" w:sz="4" w:color="D9D9D9"/>
               <w:left w:val="single" w:sz="4" w:color="D9D9D9"/>
               <w:bottom w:val="single" w:sz="4" w:color="D9D9D9"/>
               <w:right w:val="single" w:sz="4" w:color="D9D9D9"/>
             </w:tcBorders>
+            <w:shd w:fill="FFFFFF"/>
             <w:tcMar>
-              <w:top w:w="70" w:type="dxa"/>
-              <w:bottom w:w="70" w:type="dxa"/>
+              <w:top w:w="65" w:type="dxa"/>
+              <w:bottom w:w="65" w:type="dxa"/>
               <w:left w:w="90" w:type="dxa"/>
               <w:right w:w="90" w:type="dxa"/>
             </w:tcMar>
@@ -2804,6 +2599,7 @@
             </w:pPr>
             <w:r>
               <w:rPr>
+                <w:color w:val="000000"/>
                 <w:sz w:val="18"/>
               </w:rPr>
               <w:t>Community robot mission</w:t>
@@ -2819,16 +2615,16 @@
           <w:tcPr>
             <w:tcW w:type="dxa" w:w="792"/>
             <w:vAlign w:val="center"/>
-            <w:shd w:fill="F2F5F6"/>
             <w:tcBorders>
               <w:top w:val="single" w:sz="4" w:color="D9D9D9"/>
               <w:left w:val="single" w:sz="4" w:color="D9D9D9"/>
               <w:bottom w:val="single" w:sz="4" w:color="D9D9D9"/>
               <w:right w:val="single" w:sz="4" w:color="D9D9D9"/>
             </w:tcBorders>
+            <w:shd w:fill="F2F5F6"/>
             <w:tcMar>
-              <w:top w:w="70" w:type="dxa"/>
-              <w:bottom w:w="70" w:type="dxa"/>
+              <w:top w:w="65" w:type="dxa"/>
+              <w:bottom w:w="65" w:type="dxa"/>
               <w:left w:w="90" w:type="dxa"/>
               <w:right w:w="90" w:type="dxa"/>
             </w:tcMar>
@@ -2839,6 +2635,7 @@
             </w:pPr>
             <w:r>
               <w:rPr>
+                <w:color w:val="000000"/>
                 <w:sz w:val="18"/>
               </w:rPr>
               <w:t>8</w:t>
@@ -2849,16 +2646,16 @@
           <w:tcPr>
             <w:tcW w:type="dxa" w:w="2232"/>
             <w:vAlign w:val="center"/>
-            <w:shd w:fill="F2F5F6"/>
             <w:tcBorders>
               <w:top w:val="single" w:sz="4" w:color="D9D9D9"/>
               <w:left w:val="single" w:sz="4" w:color="D9D9D9"/>
               <w:bottom w:val="single" w:sz="4" w:color="D9D9D9"/>
               <w:right w:val="single" w:sz="4" w:color="D9D9D9"/>
             </w:tcBorders>
+            <w:shd w:fill="F2F5F6"/>
             <w:tcMar>
-              <w:top w:w="70" w:type="dxa"/>
-              <w:bottom w:w="70" w:type="dxa"/>
+              <w:top w:w="65" w:type="dxa"/>
+              <w:bottom w:w="65" w:type="dxa"/>
               <w:left w:w="90" w:type="dxa"/>
               <w:right w:w="90" w:type="dxa"/>
             </w:tcMar>
@@ -2869,9 +2666,10 @@
             </w:pPr>
             <w:r>
               <w:rPr>
+                <w:color w:val="000000"/>
                 <w:sz w:val="18"/>
               </w:rPr>
-              <w:t>December 16</w:t>
+              <w:t>To be agreed</w:t>
             </w:r>
           </w:p>
         </w:tc>
@@ -2879,16 +2677,16 @@
           <w:tcPr>
             <w:tcW w:type="dxa" w:w="7157"/>
             <w:vAlign w:val="center"/>
-            <w:shd w:fill="F2F5F6"/>
             <w:tcBorders>
               <w:top w:val="single" w:sz="4" w:color="D9D9D9"/>
               <w:left w:val="single" w:sz="4" w:color="D9D9D9"/>
               <w:bottom w:val="single" w:sz="4" w:color="D9D9D9"/>
               <w:right w:val="single" w:sz="4" w:color="D9D9D9"/>
             </w:tcBorders>
+            <w:shd w:fill="F2F5F6"/>
             <w:tcMar>
-              <w:top w:w="70" w:type="dxa"/>
-              <w:bottom w:w="70" w:type="dxa"/>
+              <w:top w:w="65" w:type="dxa"/>
+              <w:bottom w:w="65" w:type="dxa"/>
               <w:left w:w="90" w:type="dxa"/>
               <w:right w:w="90" w:type="dxa"/>
             </w:tcMar>
@@ -2899,6 +2697,7 @@
             </w:pPr>
             <w:r>
               <w:rPr>
+                <w:color w:val="000000"/>
                 <w:sz w:val="18"/>
               </w:rPr>
               <w:t>Robot showcase</w:t>
@@ -2914,7 +2713,7 @@
     </w:p>
     <w:p>
       <w:r>
-        <w:t>Skip Thanksgiving week, including November 25. A start in November generally cannot provide eight weekly meetings by mid-December; finish in January, begin earlier, or explicitly shorten the program. Reserve a make-up date before enrollment.</w:t>
+        <w:t>Check school holidays, Thanksgiving week, room access and the final session date when agreeing the calendar. Preserve eight one-hour sessions; do not assume the original example dates are booked.</w:t>
       </w:r>
     </w:p>
     <w:tbl>
@@ -2938,16 +2737,16 @@
           <w:tcPr>
             <w:tcW w:type="dxa" w:w="2376"/>
             <w:vAlign w:val="center"/>
-            <w:shd w:fill="243E50"/>
             <w:tcBorders>
               <w:top w:val="single" w:sz="4" w:color="D9D9D9"/>
               <w:left w:val="single" w:sz="4" w:color="D9D9D9"/>
               <w:bottom w:val="single" w:sz="4" w:color="D9D9D9"/>
               <w:right w:val="single" w:sz="4" w:color="D9D9D9"/>
             </w:tcBorders>
+            <w:shd w:fill="243E50"/>
             <w:tcMar>
-              <w:top w:w="70" w:type="dxa"/>
-              <w:bottom w:w="70" w:type="dxa"/>
+              <w:top w:w="65" w:type="dxa"/>
+              <w:bottom w:w="65" w:type="dxa"/>
               <w:left w:w="90" w:type="dxa"/>
               <w:right w:w="90" w:type="dxa"/>
             </w:tcMar>
@@ -2970,16 +2769,16 @@
           <w:tcPr>
             <w:tcW w:type="dxa" w:w="2736"/>
             <w:vAlign w:val="center"/>
-            <w:shd w:fill="243E50"/>
             <w:tcBorders>
               <w:top w:val="single" w:sz="4" w:color="D9D9D9"/>
               <w:left w:val="single" w:sz="4" w:color="D9D9D9"/>
               <w:bottom w:val="single" w:sz="4" w:color="D9D9D9"/>
               <w:right w:val="single" w:sz="4" w:color="D9D9D9"/>
             </w:tcBorders>
+            <w:shd w:fill="243E50"/>
             <w:tcMar>
-              <w:top w:w="70" w:type="dxa"/>
-              <w:bottom w:w="70" w:type="dxa"/>
+              <w:top w:w="65" w:type="dxa"/>
+              <w:bottom w:w="65" w:type="dxa"/>
               <w:left w:w="90" w:type="dxa"/>
               <w:right w:w="90" w:type="dxa"/>
             </w:tcMar>
@@ -2994,7 +2793,7 @@
                 <w:color w:val="FFFFFF"/>
                 <w:sz w:val="18"/>
               </w:rPr>
-              <w:t>Amount for eight students</w:t>
+              <w:t>Amount for 12 students</w:t>
             </w:r>
           </w:p>
         </w:tc>
@@ -3002,16 +2801,16 @@
           <w:tcPr>
             <w:tcW w:type="dxa" w:w="5069"/>
             <w:vAlign w:val="center"/>
-            <w:shd w:fill="243E50"/>
             <w:tcBorders>
               <w:top w:val="single" w:sz="4" w:color="D9D9D9"/>
               <w:left w:val="single" w:sz="4" w:color="D9D9D9"/>
               <w:bottom w:val="single" w:sz="4" w:color="D9D9D9"/>
               <w:right w:val="single" w:sz="4" w:color="D9D9D9"/>
             </w:tcBorders>
+            <w:shd w:fill="243E50"/>
             <w:tcMar>
-              <w:top w:w="70" w:type="dxa"/>
-              <w:bottom w:w="70" w:type="dxa"/>
+              <w:top w:w="65" w:type="dxa"/>
+              <w:bottom w:w="65" w:type="dxa"/>
               <w:left w:w="90" w:type="dxa"/>
               <w:right w:w="90" w:type="dxa"/>
             </w:tcMar>
@@ -3039,16 +2838,16 @@
           <w:tcPr>
             <w:tcW w:type="dxa" w:w="2376"/>
             <w:vAlign w:val="center"/>
-            <w:shd w:fill="FFFFFF"/>
             <w:tcBorders>
               <w:top w:val="single" w:sz="4" w:color="D9D9D9"/>
               <w:left w:val="single" w:sz="4" w:color="D9D9D9"/>
               <w:bottom w:val="single" w:sz="4" w:color="D9D9D9"/>
               <w:right w:val="single" w:sz="4" w:color="D9D9D9"/>
             </w:tcBorders>
+            <w:shd w:fill="FFFFFF"/>
             <w:tcMar>
-              <w:top w:w="70" w:type="dxa"/>
-              <w:bottom w:w="70" w:type="dxa"/>
+              <w:top w:w="65" w:type="dxa"/>
+              <w:bottom w:w="65" w:type="dxa"/>
               <w:left w:w="90" w:type="dxa"/>
               <w:right w:w="90" w:type="dxa"/>
             </w:tcMar>
@@ -3059,6 +2858,7 @@
             </w:pPr>
             <w:r>
               <w:rPr>
+                <w:color w:val="000000"/>
                 <w:sz w:val="18"/>
               </w:rPr>
               <w:t>SPIKE Prime kits</w:t>
@@ -3069,16 +2869,16 @@
           <w:tcPr>
             <w:tcW w:type="dxa" w:w="2736"/>
             <w:vAlign w:val="center"/>
-            <w:shd w:fill="FFFFFF"/>
             <w:tcBorders>
               <w:top w:val="single" w:sz="4" w:color="D9D9D9"/>
               <w:left w:val="single" w:sz="4" w:color="D9D9D9"/>
               <w:bottom w:val="single" w:sz="4" w:color="D9D9D9"/>
               <w:right w:val="single" w:sz="4" w:color="D9D9D9"/>
             </w:tcBorders>
+            <w:shd w:fill="FFFFFF"/>
             <w:tcMar>
-              <w:top w:w="70" w:type="dxa"/>
-              <w:bottom w:w="70" w:type="dxa"/>
+              <w:top w:w="65" w:type="dxa"/>
+              <w:bottom w:w="65" w:type="dxa"/>
               <w:left w:w="90" w:type="dxa"/>
               <w:right w:w="90" w:type="dxa"/>
             </w:tcMar>
@@ -3089,6 +2889,7 @@
             </w:pPr>
             <w:r>
               <w:rPr>
+                <w:color w:val="000000"/>
                 <w:sz w:val="18"/>
               </w:rPr>
               <w:t>2 complete working sets</w:t>
@@ -3099,16 +2900,16 @@
           <w:tcPr>
             <w:tcW w:type="dxa" w:w="5069"/>
             <w:vAlign w:val="center"/>
-            <w:shd w:fill="FFFFFF"/>
             <w:tcBorders>
               <w:top w:val="single" w:sz="4" w:color="D9D9D9"/>
               <w:left w:val="single" w:sz="4" w:color="D9D9D9"/>
               <w:bottom w:val="single" w:sz="4" w:color="D9D9D9"/>
               <w:right w:val="single" w:sz="4" w:color="D9D9D9"/>
             </w:tcBorders>
+            <w:shd w:fill="FFFFFF"/>
             <w:tcMar>
-              <w:top w:w="70" w:type="dxa"/>
-              <w:bottom w:w="70" w:type="dxa"/>
+              <w:top w:w="65" w:type="dxa"/>
+              <w:bottom w:w="65" w:type="dxa"/>
               <w:left w:w="90" w:type="dxa"/>
               <w:right w:w="90" w:type="dxa"/>
             </w:tcMar>
@@ -3119,6 +2920,7 @@
             </w:pPr>
             <w:r>
               <w:rPr>
+                <w:color w:val="000000"/>
                 <w:sz w:val="18"/>
               </w:rPr>
               <w:t>Existing YMCA equipment; inspect first</w:t>
@@ -3134,16 +2936,16 @@
           <w:tcPr>
             <w:tcW w:type="dxa" w:w="2376"/>
             <w:vAlign w:val="center"/>
-            <w:shd w:fill="F2F5F6"/>
             <w:tcBorders>
               <w:top w:val="single" w:sz="4" w:color="D9D9D9"/>
               <w:left w:val="single" w:sz="4" w:color="D9D9D9"/>
               <w:bottom w:val="single" w:sz="4" w:color="D9D9D9"/>
               <w:right w:val="single" w:sz="4" w:color="D9D9D9"/>
             </w:tcBorders>
+            <w:shd w:fill="F2F5F6"/>
             <w:tcMar>
-              <w:top w:w="70" w:type="dxa"/>
-              <w:bottom w:w="70" w:type="dxa"/>
+              <w:top w:w="65" w:type="dxa"/>
+              <w:bottom w:w="65" w:type="dxa"/>
               <w:left w:w="90" w:type="dxa"/>
               <w:right w:w="90" w:type="dxa"/>
             </w:tcMar>
@@ -3154,6 +2956,7 @@
             </w:pPr>
             <w:r>
               <w:rPr>
+                <w:color w:val="000000"/>
                 <w:sz w:val="18"/>
               </w:rPr>
               <w:t>Laptops</w:t>
@@ -3164,16 +2967,16 @@
           <w:tcPr>
             <w:tcW w:type="dxa" w:w="2736"/>
             <w:vAlign w:val="center"/>
-            <w:shd w:fill="F2F5F6"/>
             <w:tcBorders>
               <w:top w:val="single" w:sz="4" w:color="D9D9D9"/>
               <w:left w:val="single" w:sz="4" w:color="D9D9D9"/>
               <w:bottom w:val="single" w:sz="4" w:color="D9D9D9"/>
               <w:right w:val="single" w:sz="4" w:color="D9D9D9"/>
             </w:tcBorders>
+            <w:shd w:fill="F2F5F6"/>
             <w:tcMar>
-              <w:top w:w="70" w:type="dxa"/>
-              <w:bottom w:w="70" w:type="dxa"/>
+              <w:top w:w="65" w:type="dxa"/>
+              <w:bottom w:w="65" w:type="dxa"/>
               <w:left w:w="90" w:type="dxa"/>
               <w:right w:w="90" w:type="dxa"/>
             </w:tcMar>
@@ -3184,9 +2987,10 @@
             </w:pPr>
             <w:r>
               <w:rPr>
+                <w:color w:val="000000"/>
                 <w:sz w:val="18"/>
               </w:rPr>
-              <w:t>4 preferred, 2 minimum</w:t>
+              <w:t>4 available; bring all 4</w:t>
             </w:r>
           </w:p>
         </w:tc>
@@ -3194,16 +2998,16 @@
           <w:tcPr>
             <w:tcW w:type="dxa" w:w="5069"/>
             <w:vAlign w:val="center"/>
-            <w:shd w:fill="F2F5F6"/>
             <w:tcBorders>
               <w:top w:val="single" w:sz="4" w:color="D9D9D9"/>
               <w:left w:val="single" w:sz="4" w:color="D9D9D9"/>
               <w:bottom w:val="single" w:sz="4" w:color="D9D9D9"/>
               <w:right w:val="single" w:sz="4" w:color="D9D9D9"/>
             </w:tcBorders>
+            <w:shd w:fill="F2F5F6"/>
             <w:tcMar>
-              <w:top w:w="70" w:type="dxa"/>
-              <w:bottom w:w="70" w:type="dxa"/>
+              <w:top w:w="65" w:type="dxa"/>
+              <w:bottom w:w="65" w:type="dxa"/>
               <w:left w:w="90" w:type="dxa"/>
               <w:right w:w="90" w:type="dxa"/>
             </w:tcMar>
@@ -3214,9 +3018,10 @@
             </w:pPr>
             <w:r>
               <w:rPr>
+                <w:color w:val="000000"/>
                 <w:sz w:val="18"/>
               </w:rPr>
-              <w:t>Borrowed or partner supplied; not yet confirmed</w:t>
+              <w:t>2 robot control and 2 build references</w:t>
             </w:r>
           </w:p>
         </w:tc>
@@ -3229,16 +3034,16 @@
           <w:tcPr>
             <w:tcW w:type="dxa" w:w="2376"/>
             <w:vAlign w:val="center"/>
-            <w:shd w:fill="FFFFFF"/>
             <w:tcBorders>
               <w:top w:val="single" w:sz="4" w:color="D9D9D9"/>
               <w:left w:val="single" w:sz="4" w:color="D9D9D9"/>
               <w:bottom w:val="single" w:sz="4" w:color="D9D9D9"/>
               <w:right w:val="single" w:sz="4" w:color="D9D9D9"/>
             </w:tcBorders>
+            <w:shd w:fill="FFFFFF"/>
             <w:tcMar>
-              <w:top w:w="70" w:type="dxa"/>
-              <w:bottom w:w="70" w:type="dxa"/>
+              <w:top w:w="65" w:type="dxa"/>
+              <w:bottom w:w="65" w:type="dxa"/>
               <w:left w:w="90" w:type="dxa"/>
               <w:right w:w="90" w:type="dxa"/>
             </w:tcMar>
@@ -3249,6 +3054,7 @@
             </w:pPr>
             <w:r>
               <w:rPr>
+                <w:color w:val="000000"/>
                 <w:sz w:val="18"/>
               </w:rPr>
               <w:t>Charging and data cables</w:t>
@@ -3259,16 +3065,16 @@
           <w:tcPr>
             <w:tcW w:type="dxa" w:w="2736"/>
             <w:vAlign w:val="center"/>
-            <w:shd w:fill="FFFFFF"/>
             <w:tcBorders>
               <w:top w:val="single" w:sz="4" w:color="D9D9D9"/>
               <w:left w:val="single" w:sz="4" w:color="D9D9D9"/>
               <w:bottom w:val="single" w:sz="4" w:color="D9D9D9"/>
               <w:right w:val="single" w:sz="4" w:color="D9D9D9"/>
             </w:tcBorders>
+            <w:shd w:fill="FFFFFF"/>
             <w:tcMar>
-              <w:top w:w="70" w:type="dxa"/>
-              <w:bottom w:w="70" w:type="dxa"/>
+              <w:top w:w="65" w:type="dxa"/>
+              <w:bottom w:w="65" w:type="dxa"/>
               <w:left w:w="90" w:type="dxa"/>
               <w:right w:w="90" w:type="dxa"/>
             </w:tcMar>
@@ -3279,6 +3085,7 @@
             </w:pPr>
             <w:r>
               <w:rPr>
+                <w:color w:val="000000"/>
                 <w:sz w:val="18"/>
               </w:rPr>
               <w:t>2 compatible sets</w:t>
@@ -3289,16 +3096,16 @@
           <w:tcPr>
             <w:tcW w:type="dxa" w:w="5069"/>
             <w:vAlign w:val="center"/>
-            <w:shd w:fill="FFFFFF"/>
             <w:tcBorders>
               <w:top w:val="single" w:sz="4" w:color="D9D9D9"/>
               <w:left w:val="single" w:sz="4" w:color="D9D9D9"/>
               <w:bottom w:val="single" w:sz="4" w:color="D9D9D9"/>
               <w:right w:val="single" w:sz="4" w:color="D9D9D9"/>
             </w:tcBorders>
+            <w:shd w:fill="FFFFFF"/>
             <w:tcMar>
-              <w:top w:w="70" w:type="dxa"/>
-              <w:bottom w:w="70" w:type="dxa"/>
+              <w:top w:w="65" w:type="dxa"/>
+              <w:bottom w:w="65" w:type="dxa"/>
               <w:left w:w="90" w:type="dxa"/>
               <w:right w:w="90" w:type="dxa"/>
             </w:tcMar>
@@ -3309,6 +3116,7 @@
             </w:pPr>
             <w:r>
               <w:rPr>
+                <w:color w:val="000000"/>
                 <w:sz w:val="18"/>
               </w:rPr>
               <w:t>Inventory first; use data-capable USB for setup</w:t>
@@ -3324,16 +3132,16 @@
           <w:tcPr>
             <w:tcW w:type="dxa" w:w="2376"/>
             <w:vAlign w:val="center"/>
-            <w:shd w:fill="F2F5F6"/>
             <w:tcBorders>
               <w:top w:val="single" w:sz="4" w:color="D9D9D9"/>
               <w:left w:val="single" w:sz="4" w:color="D9D9D9"/>
               <w:bottom w:val="single" w:sz="4" w:color="D9D9D9"/>
               <w:right w:val="single" w:sz="4" w:color="D9D9D9"/>
             </w:tcBorders>
+            <w:shd w:fill="F2F5F6"/>
             <w:tcMar>
-              <w:top w:w="70" w:type="dxa"/>
-              <w:bottom w:w="70" w:type="dxa"/>
+              <w:top w:w="65" w:type="dxa"/>
+              <w:bottom w:w="65" w:type="dxa"/>
               <w:left w:w="90" w:type="dxa"/>
               <w:right w:w="90" w:type="dxa"/>
             </w:tcMar>
@@ -3344,6 +3152,7 @@
             </w:pPr>
             <w:r>
               <w:rPr>
+                <w:color w:val="000000"/>
                 <w:sz w:val="18"/>
               </w:rPr>
               <w:t>Paper, printing, pencils, tape</w:t>
@@ -3354,16 +3163,16 @@
           <w:tcPr>
             <w:tcW w:type="dxa" w:w="2736"/>
             <w:vAlign w:val="center"/>
-            <w:shd w:fill="F2F5F6"/>
             <w:tcBorders>
               <w:top w:val="single" w:sz="4" w:color="D9D9D9"/>
               <w:left w:val="single" w:sz="4" w:color="D9D9D9"/>
               <w:bottom w:val="single" w:sz="4" w:color="D9D9D9"/>
               <w:right w:val="single" w:sz="4" w:color="D9D9D9"/>
             </w:tcBorders>
+            <w:shd w:fill="F2F5F6"/>
             <w:tcMar>
-              <w:top w:w="70" w:type="dxa"/>
-              <w:bottom w:w="70" w:type="dxa"/>
+              <w:top w:w="65" w:type="dxa"/>
+              <w:bottom w:w="65" w:type="dxa"/>
               <w:left w:w="90" w:type="dxa"/>
               <w:right w:w="90" w:type="dxa"/>
             </w:tcMar>
@@ -3374,9 +3183,10 @@
             </w:pPr>
             <w:r>
               <w:rPr>
+                <w:color w:val="000000"/>
                 <w:sz w:val="18"/>
               </w:rPr>
-              <w:t>8 workbooks and reusable task cards</w:t>
+              <w:t>Weekly team sheets, build cards, 14 pencils</w:t>
             </w:r>
           </w:p>
         </w:tc>
@@ -3384,16 +3194,16 @@
           <w:tcPr>
             <w:tcW w:type="dxa" w:w="5069"/>
             <w:vAlign w:val="center"/>
-            <w:shd w:fill="F2F5F6"/>
             <w:tcBorders>
               <w:top w:val="single" w:sz="4" w:color="D9D9D9"/>
               <w:left w:val="single" w:sz="4" w:color="D9D9D9"/>
               <w:bottom w:val="single" w:sz="4" w:color="D9D9D9"/>
               <w:right w:val="single" w:sz="4" w:color="D9D9D9"/>
             </w:tcBorders>
+            <w:shd w:fill="F2F5F6"/>
             <w:tcMar>
-              <w:top w:w="70" w:type="dxa"/>
-              <w:bottom w:w="70" w:type="dxa"/>
+              <w:top w:w="65" w:type="dxa"/>
+              <w:bottom w:w="65" w:type="dxa"/>
               <w:left w:w="90" w:type="dxa"/>
               <w:right w:w="90" w:type="dxa"/>
             </w:tcMar>
@@ -3404,9 +3214,10 @@
             </w:pPr>
             <w:r>
               <w:rPr>
+                <w:color w:val="000000"/>
                 <w:sz w:val="18"/>
               </w:rPr>
-              <w:t>Planning allowance $20–35</w:t>
+              <w:t>Use per-session checklists; inventory owned supplies first</w:t>
             </w:r>
           </w:p>
         </w:tc>
@@ -3419,16 +3230,16 @@
           <w:tcPr>
             <w:tcW w:type="dxa" w:w="2376"/>
             <w:vAlign w:val="center"/>
-            <w:shd w:fill="FFFFFF"/>
             <w:tcBorders>
               <w:top w:val="single" w:sz="4" w:color="D9D9D9"/>
               <w:left w:val="single" w:sz="4" w:color="D9D9D9"/>
               <w:bottom w:val="single" w:sz="4" w:color="D9D9D9"/>
               <w:right w:val="single" w:sz="4" w:color="D9D9D9"/>
             </w:tcBorders>
+            <w:shd w:fill="FFFFFF"/>
             <w:tcMar>
-              <w:top w:w="70" w:type="dxa"/>
-              <w:bottom w:w="70" w:type="dxa"/>
+              <w:top w:w="65" w:type="dxa"/>
+              <w:bottom w:w="65" w:type="dxa"/>
               <w:left w:w="90" w:type="dxa"/>
               <w:right w:w="90" w:type="dxa"/>
             </w:tcMar>
@@ -3439,6 +3250,7 @@
             </w:pPr>
             <w:r>
               <w:rPr>
+                <w:color w:val="000000"/>
                 <w:sz w:val="18"/>
               </w:rPr>
               <w:t>Floor surface, rulers, cardboard, cubes</w:t>
@@ -3449,16 +3261,16 @@
           <w:tcPr>
             <w:tcW w:type="dxa" w:w="2736"/>
             <w:vAlign w:val="center"/>
-            <w:shd w:fill="FFFFFF"/>
             <w:tcBorders>
               <w:top w:val="single" w:sz="4" w:color="D9D9D9"/>
               <w:left w:val="single" w:sz="4" w:color="D9D9D9"/>
               <w:bottom w:val="single" w:sz="4" w:color="D9D9D9"/>
               <w:right w:val="single" w:sz="4" w:color="D9D9D9"/>
             </w:tcBorders>
+            <w:shd w:fill="FFFFFF"/>
             <w:tcMar>
-              <w:top w:w="70" w:type="dxa"/>
-              <w:bottom w:w="70" w:type="dxa"/>
+              <w:top w:w="65" w:type="dxa"/>
+              <w:bottom w:w="65" w:type="dxa"/>
               <w:left w:w="90" w:type="dxa"/>
               <w:right w:w="90" w:type="dxa"/>
             </w:tcMar>
@@ -3469,9 +3281,10 @@
             </w:pPr>
             <w:r>
               <w:rPr>
+                <w:color w:val="000000"/>
                 <w:sz w:val="18"/>
               </w:rPr>
-              <w:t>2 lanes and 2 lightweight payloads</w:t>
+              <w:t>2 lanes, 4 rulers, up to 6 cubes</w:t>
             </w:r>
           </w:p>
         </w:tc>
@@ -3479,16 +3292,16 @@
           <w:tcPr>
             <w:tcW w:type="dxa" w:w="5069"/>
             <w:vAlign w:val="center"/>
-            <w:shd w:fill="FFFFFF"/>
             <w:tcBorders>
               <w:top w:val="single" w:sz="4" w:color="D9D9D9"/>
               <w:left w:val="single" w:sz="4" w:color="D9D9D9"/>
               <w:bottom w:val="single" w:sz="4" w:color="D9D9D9"/>
               <w:right w:val="single" w:sz="4" w:color="D9D9D9"/>
             </w:tcBorders>
+            <w:shd w:fill="FFFFFF"/>
             <w:tcMar>
-              <w:top w:w="70" w:type="dxa"/>
-              <w:bottom w:w="70" w:type="dxa"/>
+              <w:top w:w="65" w:type="dxa"/>
+              <w:bottom w:w="65" w:type="dxa"/>
               <w:left w:w="90" w:type="dxa"/>
               <w:right w:w="90" w:type="dxa"/>
             </w:tcMar>
@@ -3499,9 +3312,10 @@
             </w:pPr>
             <w:r>
               <w:rPr>
+                <w:color w:val="000000"/>
                 <w:sz w:val="18"/>
               </w:rPr>
-              <w:t>Planning allowance $15–35 using recycled materials</w:t>
+              <w:t>Reusable kit plus weekly build supplies</w:t>
             </w:r>
           </w:p>
         </w:tc>
@@ -3514,16 +3328,16 @@
           <w:tcPr>
             <w:tcW w:type="dxa" w:w="2376"/>
             <w:vAlign w:val="center"/>
-            <w:shd w:fill="F2F5F6"/>
             <w:tcBorders>
               <w:top w:val="single" w:sz="4" w:color="D9D9D9"/>
               <w:left w:val="single" w:sz="4" w:color="D9D9D9"/>
               <w:bottom w:val="single" w:sz="4" w:color="D9D9D9"/>
               <w:right w:val="single" w:sz="4" w:color="D9D9D9"/>
             </w:tcBorders>
+            <w:shd w:fill="F2F5F6"/>
             <w:tcMar>
-              <w:top w:w="70" w:type="dxa"/>
-              <w:bottom w:w="70" w:type="dxa"/>
+              <w:top w:w="65" w:type="dxa"/>
+              <w:bottom w:w="65" w:type="dxa"/>
               <w:left w:w="90" w:type="dxa"/>
               <w:right w:w="90" w:type="dxa"/>
             </w:tcMar>
@@ -3534,6 +3348,7 @@
             </w:pPr>
             <w:r>
               <w:rPr>
+                <w:color w:val="000000"/>
                 <w:sz w:val="18"/>
               </w:rPr>
               <w:t>Storage</w:t>
@@ -3544,16 +3359,16 @@
           <w:tcPr>
             <w:tcW w:type="dxa" w:w="2736"/>
             <w:vAlign w:val="center"/>
-            <w:shd w:fill="F2F5F6"/>
             <w:tcBorders>
               <w:top w:val="single" w:sz="4" w:color="D9D9D9"/>
               <w:left w:val="single" w:sz="4" w:color="D9D9D9"/>
               <w:bottom w:val="single" w:sz="4" w:color="D9D9D9"/>
               <w:right w:val="single" w:sz="4" w:color="D9D9D9"/>
             </w:tcBorders>
+            <w:shd w:fill="F2F5F6"/>
             <w:tcMar>
-              <w:top w:w="70" w:type="dxa"/>
-              <w:bottom w:w="70" w:type="dxa"/>
+              <w:top w:w="65" w:type="dxa"/>
+              <w:bottom w:w="65" w:type="dxa"/>
               <w:left w:w="90" w:type="dxa"/>
               <w:right w:w="90" w:type="dxa"/>
             </w:tcMar>
@@ -3564,6 +3379,7 @@
             </w:pPr>
             <w:r>
               <w:rPr>
+                <w:color w:val="000000"/>
                 <w:sz w:val="18"/>
               </w:rPr>
               <w:t>2 kit bins and 4 small attachment trays</w:t>
@@ -3574,16 +3390,16 @@
           <w:tcPr>
             <w:tcW w:type="dxa" w:w="5069"/>
             <w:vAlign w:val="center"/>
-            <w:shd w:fill="F2F5F6"/>
             <w:tcBorders>
               <w:top w:val="single" w:sz="4" w:color="D9D9D9"/>
               <w:left w:val="single" w:sz="4" w:color="D9D9D9"/>
               <w:bottom w:val="single" w:sz="4" w:color="D9D9D9"/>
               <w:right w:val="single" w:sz="4" w:color="D9D9D9"/>
             </w:tcBorders>
+            <w:shd w:fill="F2F5F6"/>
             <w:tcMar>
-              <w:top w:w="70" w:type="dxa"/>
-              <w:bottom w:w="70" w:type="dxa"/>
+              <w:top w:w="65" w:type="dxa"/>
+              <w:bottom w:w="65" w:type="dxa"/>
               <w:left w:w="90" w:type="dxa"/>
               <w:right w:w="90" w:type="dxa"/>
             </w:tcMar>
@@ -3594,6 +3410,7 @@
             </w:pPr>
             <w:r>
               <w:rPr>
+                <w:color w:val="000000"/>
                 <w:sz w:val="18"/>
               </w:rPr>
               <w:t>Reuse available containers</w:t>
@@ -3661,7 +3478,7 @@
     </w:p>
     <w:p>
       <w:r>
-        <w:t>Each lesson includes a parallel Word Blocks path with the same prediction and physical outcome. Switch a pair or the class when typing or connection difficulties prevent learning. Return to the same concept later. Record which language students used so final learning claims are accurate.</w:t>
+        <w:t>Each lesson includes a parallel Word Blocks path with the same prediction and physical outcome. Switch a team or the class when typing or connection difficulties prevent learning. Return to the same concept later. Record which language students used so final learning claims are accurate.</w:t>
       </w:r>
     </w:p>
     <w:tbl>
@@ -3685,16 +3502,16 @@
           <w:tcPr>
             <w:tcW w:type="dxa" w:w="2736"/>
             <w:vAlign w:val="center"/>
-            <w:shd w:fill="243E50"/>
             <w:tcBorders>
               <w:top w:val="single" w:sz="4" w:color="D9D9D9"/>
               <w:left w:val="single" w:sz="4" w:color="D9D9D9"/>
               <w:bottom w:val="single" w:sz="4" w:color="D9D9D9"/>
               <w:right w:val="single" w:sz="4" w:color="D9D9D9"/>
             </w:tcBorders>
+            <w:shd w:fill="243E50"/>
             <w:tcMar>
-              <w:top w:w="70" w:type="dxa"/>
-              <w:bottom w:w="70" w:type="dxa"/>
+              <w:top w:w="65" w:type="dxa"/>
+              <w:bottom w:w="65" w:type="dxa"/>
               <w:left w:w="90" w:type="dxa"/>
               <w:right w:w="90" w:type="dxa"/>
             </w:tcMar>
@@ -3717,16 +3534,16 @@
           <w:tcPr>
             <w:tcW w:type="dxa" w:w="3744"/>
             <w:vAlign w:val="center"/>
-            <w:shd w:fill="243E50"/>
             <w:tcBorders>
               <w:top w:val="single" w:sz="4" w:color="D9D9D9"/>
               <w:left w:val="single" w:sz="4" w:color="D9D9D9"/>
               <w:bottom w:val="single" w:sz="4" w:color="D9D9D9"/>
               <w:right w:val="single" w:sz="4" w:color="D9D9D9"/>
             </w:tcBorders>
+            <w:shd w:fill="243E50"/>
             <w:tcMar>
-              <w:top w:w="70" w:type="dxa"/>
-              <w:bottom w:w="70" w:type="dxa"/>
+              <w:top w:w="65" w:type="dxa"/>
+              <w:bottom w:w="65" w:type="dxa"/>
               <w:left w:w="90" w:type="dxa"/>
               <w:right w:w="90" w:type="dxa"/>
             </w:tcMar>
@@ -3749,16 +3566,16 @@
           <w:tcPr>
             <w:tcW w:type="dxa" w:w="3701"/>
             <w:vAlign w:val="center"/>
-            <w:shd w:fill="243E50"/>
             <w:tcBorders>
               <w:top w:val="single" w:sz="4" w:color="D9D9D9"/>
               <w:left w:val="single" w:sz="4" w:color="D9D9D9"/>
               <w:bottom w:val="single" w:sz="4" w:color="D9D9D9"/>
               <w:right w:val="single" w:sz="4" w:color="D9D9D9"/>
             </w:tcBorders>
+            <w:shd w:fill="243E50"/>
             <w:tcMar>
-              <w:top w:w="70" w:type="dxa"/>
-              <w:bottom w:w="70" w:type="dxa"/>
+              <w:top w:w="65" w:type="dxa"/>
+              <w:bottom w:w="65" w:type="dxa"/>
               <w:left w:w="90" w:type="dxa"/>
               <w:right w:w="90" w:type="dxa"/>
             </w:tcMar>
@@ -3786,16 +3603,16 @@
           <w:tcPr>
             <w:tcW w:type="dxa" w:w="2736"/>
             <w:vAlign w:val="center"/>
-            <w:shd w:fill="FFFFFF"/>
             <w:tcBorders>
               <w:top w:val="single" w:sz="4" w:color="D9D9D9"/>
               <w:left w:val="single" w:sz="4" w:color="D9D9D9"/>
               <w:bottom w:val="single" w:sz="4" w:color="D9D9D9"/>
               <w:right w:val="single" w:sz="4" w:color="D9D9D9"/>
             </w:tcBorders>
+            <w:shd w:fill="FFFFFF"/>
             <w:tcMar>
-              <w:top w:w="70" w:type="dxa"/>
-              <w:bottom w:w="70" w:type="dxa"/>
+              <w:top w:w="65" w:type="dxa"/>
+              <w:bottom w:w="65" w:type="dxa"/>
               <w:left w:w="90" w:type="dxa"/>
               <w:right w:w="90" w:type="dxa"/>
             </w:tcMar>
@@ -3806,6 +3623,7 @@
             </w:pPr>
             <w:r>
               <w:rPr>
+                <w:color w:val="000000"/>
                 <w:sz w:val="18"/>
               </w:rPr>
               <w:t>Official app onboarding [2]</w:t>
@@ -3816,16 +3634,16 @@
           <w:tcPr>
             <w:tcW w:type="dxa" w:w="3744"/>
             <w:vAlign w:val="center"/>
-            <w:shd w:fill="FFFFFF"/>
             <w:tcBorders>
               <w:top w:val="single" w:sz="4" w:color="D9D9D9"/>
               <w:left w:val="single" w:sz="4" w:color="D9D9D9"/>
               <w:bottom w:val="single" w:sz="4" w:color="D9D9D9"/>
               <w:right w:val="single" w:sz="4" w:color="D9D9D9"/>
             </w:tcBorders>
+            <w:shd w:fill="FFFFFF"/>
             <w:tcMar>
-              <w:top w:w="70" w:type="dxa"/>
-              <w:bottom w:w="70" w:type="dxa"/>
+              <w:top w:w="65" w:type="dxa"/>
+              <w:bottom w:w="65" w:type="dxa"/>
               <w:left w:w="90" w:type="dxa"/>
               <w:right w:w="90" w:type="dxa"/>
             </w:tcMar>
@@ -3836,6 +3654,7 @@
             </w:pPr>
             <w:r>
               <w:rPr>
+                <w:color w:val="000000"/>
                 <w:sz w:val="18"/>
               </w:rPr>
               <w:t>Mentor setup and device rehearsal</w:t>
@@ -3846,16 +3665,16 @@
           <w:tcPr>
             <w:tcW w:type="dxa" w:w="3701"/>
             <w:vAlign w:val="center"/>
-            <w:shd w:fill="FFFFFF"/>
             <w:tcBorders>
               <w:top w:val="single" w:sz="4" w:color="D9D9D9"/>
               <w:left w:val="single" w:sz="4" w:color="D9D9D9"/>
               <w:bottom w:val="single" w:sz="4" w:color="D9D9D9"/>
               <w:right w:val="single" w:sz="4" w:color="D9D9D9"/>
             </w:tcBorders>
+            <w:shd w:fill="FFFFFF"/>
             <w:tcMar>
-              <w:top w:w="70" w:type="dxa"/>
-              <w:bottom w:w="70" w:type="dxa"/>
+              <w:top w:w="65" w:type="dxa"/>
+              <w:bottom w:w="65" w:type="dxa"/>
               <w:left w:w="90" w:type="dxa"/>
               <w:right w:w="90" w:type="dxa"/>
             </w:tcMar>
@@ -3866,6 +3685,7 @@
             </w:pPr>
             <w:r>
               <w:rPr>
+                <w:color w:val="000000"/>
                 <w:sz w:val="18"/>
               </w:rPr>
               <w:t>Test the exact installed version</w:t>
@@ -3881,16 +3701,16 @@
           <w:tcPr>
             <w:tcW w:type="dxa" w:w="2736"/>
             <w:vAlign w:val="center"/>
-            <w:shd w:fill="F2F5F6"/>
             <w:tcBorders>
               <w:top w:val="single" w:sz="4" w:color="D9D9D9"/>
               <w:left w:val="single" w:sz="4" w:color="D9D9D9"/>
               <w:bottom w:val="single" w:sz="4" w:color="D9D9D9"/>
               <w:right w:val="single" w:sz="4" w:color="D9D9D9"/>
             </w:tcBorders>
+            <w:shd w:fill="F2F5F6"/>
             <w:tcMar>
-              <w:top w:w="70" w:type="dxa"/>
-              <w:bottom w:w="70" w:type="dxa"/>
+              <w:top w:w="65" w:type="dxa"/>
+              <w:bottom w:w="65" w:type="dxa"/>
               <w:left w:w="90" w:type="dxa"/>
               <w:right w:w="90" w:type="dxa"/>
             </w:tcMar>
@@ -3901,6 +3721,7 @@
             </w:pPr>
             <w:r>
               <w:rPr>
+                <w:color w:val="000000"/>
                 <w:sz w:val="18"/>
               </w:rPr>
               <w:t>Driving Around and build [3–4]</w:t>
@@ -3911,16 +3732,16 @@
           <w:tcPr>
             <w:tcW w:type="dxa" w:w="3744"/>
             <w:vAlign w:val="center"/>
-            <w:shd w:fill="F2F5F6"/>
             <w:tcBorders>
               <w:top w:val="single" w:sz="4" w:color="D9D9D9"/>
               <w:left w:val="single" w:sz="4" w:color="D9D9D9"/>
               <w:bottom w:val="single" w:sz="4" w:color="D9D9D9"/>
               <w:right w:val="single" w:sz="4" w:color="D9D9D9"/>
             </w:tcBorders>
+            <w:shd w:fill="F2F5F6"/>
             <w:tcMar>
-              <w:top w:w="70" w:type="dxa"/>
-              <w:bottom w:w="70" w:type="dxa"/>
+              <w:top w:w="65" w:type="dxa"/>
+              <w:bottom w:w="65" w:type="dxa"/>
               <w:left w:w="90" w:type="dxa"/>
               <w:right w:w="90" w:type="dxa"/>
             </w:tcMar>
@@ -3931,6 +3752,7 @@
             </w:pPr>
             <w:r>
               <w:rPr>
+                <w:color w:val="000000"/>
                 <w:sz w:val="18"/>
               </w:rPr>
               <w:t>Common base and beginner movement ideas</w:t>
@@ -3941,16 +3763,16 @@
           <w:tcPr>
             <w:tcW w:type="dxa" w:w="3701"/>
             <w:vAlign w:val="center"/>
-            <w:shd w:fill="F2F5F6"/>
             <w:tcBorders>
               <w:top w:val="single" w:sz="4" w:color="D9D9D9"/>
               <w:left w:val="single" w:sz="4" w:color="D9D9D9"/>
               <w:bottom w:val="single" w:sz="4" w:color="D9D9D9"/>
               <w:right w:val="single" w:sz="4" w:color="D9D9D9"/>
             </w:tcBorders>
+            <w:shd w:fill="F2F5F6"/>
             <w:tcMar>
-              <w:top w:w="70" w:type="dxa"/>
-              <w:bottom w:w="70" w:type="dxa"/>
+              <w:top w:w="65" w:type="dxa"/>
+              <w:bottom w:w="65" w:type="dxa"/>
               <w:left w:w="90" w:type="dxa"/>
               <w:right w:w="90" w:type="dxa"/>
             </w:tcMar>
@@ -3961,6 +3783,7 @@
             </w:pPr>
             <w:r>
               <w:rPr>
+                <w:color w:val="000000"/>
                 <w:sz w:val="18"/>
               </w:rPr>
               <w:t>Our sessions and port map differ</w:t>
@@ -3976,16 +3799,16 @@
           <w:tcPr>
             <w:tcW w:type="dxa" w:w="2736"/>
             <w:vAlign w:val="center"/>
-            <w:shd w:fill="FFFFFF"/>
             <w:tcBorders>
               <w:top w:val="single" w:sz="4" w:color="D9D9D9"/>
               <w:left w:val="single" w:sz="4" w:color="D9D9D9"/>
               <w:bottom w:val="single" w:sz="4" w:color="D9D9D9"/>
               <w:right w:val="single" w:sz="4" w:color="D9D9D9"/>
             </w:tcBorders>
+            <w:shd w:fill="FFFFFF"/>
             <w:tcMar>
-              <w:top w:w="70" w:type="dxa"/>
-              <w:bottom w:w="70" w:type="dxa"/>
+              <w:top w:w="65" w:type="dxa"/>
+              <w:bottom w:w="65" w:type="dxa"/>
               <w:left w:w="90" w:type="dxa"/>
               <w:right w:w="90" w:type="dxa"/>
             </w:tcMar>
@@ -3996,6 +3819,7 @@
             </w:pPr>
             <w:r>
               <w:rPr>
+                <w:color w:val="000000"/>
                 <w:sz w:val="18"/>
               </w:rPr>
               <w:t>Official Python unit and guide [5–6]</w:t>
@@ -4006,16 +3830,16 @@
           <w:tcPr>
             <w:tcW w:type="dxa" w:w="3744"/>
             <w:vAlign w:val="center"/>
-            <w:shd w:fill="FFFFFF"/>
             <w:tcBorders>
               <w:top w:val="single" w:sz="4" w:color="D9D9D9"/>
               <w:left w:val="single" w:sz="4" w:color="D9D9D9"/>
               <w:bottom w:val="single" w:sz="4" w:color="D9D9D9"/>
               <w:right w:val="single" w:sz="4" w:color="D9D9D9"/>
             </w:tcBorders>
+            <w:shd w:fill="FFFFFF"/>
             <w:tcMar>
-              <w:top w:w="70" w:type="dxa"/>
-              <w:bottom w:w="70" w:type="dxa"/>
+              <w:top w:w="65" w:type="dxa"/>
+              <w:bottom w:w="65" w:type="dxa"/>
               <w:left w:w="90" w:type="dxa"/>
               <w:right w:w="90" w:type="dxa"/>
             </w:tcMar>
@@ -4026,6 +3850,7 @@
             </w:pPr>
             <w:r>
               <w:rPr>
+                <w:color w:val="000000"/>
                 <w:sz w:val="18"/>
               </w:rPr>
               <w:t>Instructor background and future extensions</w:t>
@@ -4036,16 +3861,16 @@
           <w:tcPr>
             <w:tcW w:type="dxa" w:w="3701"/>
             <w:vAlign w:val="center"/>
-            <w:shd w:fill="FFFFFF"/>
             <w:tcBorders>
               <w:top w:val="single" w:sz="4" w:color="D9D9D9"/>
               <w:left w:val="single" w:sz="4" w:color="D9D9D9"/>
               <w:bottom w:val="single" w:sz="4" w:color="D9D9D9"/>
               <w:right w:val="single" w:sz="4" w:color="D9D9D9"/>
             </w:tcBorders>
+            <w:shd w:fill="FFFFFF"/>
             <w:tcMar>
-              <w:top w:w="70" w:type="dxa"/>
-              <w:bottom w:w="70" w:type="dxa"/>
+              <w:top w:w="65" w:type="dxa"/>
+              <w:bottom w:w="65" w:type="dxa"/>
               <w:left w:w="90" w:type="dxa"/>
               <w:right w:w="90" w:type="dxa"/>
             </w:tcMar>
@@ -4056,6 +3881,7 @@
             </w:pPr>
             <w:r>
               <w:rPr>
+                <w:color w:val="000000"/>
                 <w:sz w:val="18"/>
               </w:rPr>
               <w:t>Full curriculum exceeds eight hours</w:t>
@@ -4071,16 +3897,16 @@
           <w:tcPr>
             <w:tcW w:type="dxa" w:w="2736"/>
             <w:vAlign w:val="center"/>
-            <w:shd w:fill="F2F5F6"/>
             <w:tcBorders>
               <w:top w:val="single" w:sz="4" w:color="D9D9D9"/>
               <w:left w:val="single" w:sz="4" w:color="D9D9D9"/>
               <w:bottom w:val="single" w:sz="4" w:color="D9D9D9"/>
               <w:right w:val="single" w:sz="4" w:color="D9D9D9"/>
             </w:tcBorders>
+            <w:shd w:fill="F2F5F6"/>
             <w:tcMar>
-              <w:top w:w="70" w:type="dxa"/>
-              <w:bottom w:w="70" w:type="dxa"/>
+              <w:top w:w="65" w:type="dxa"/>
+              <w:bottom w:w="65" w:type="dxa"/>
               <w:left w:w="90" w:type="dxa"/>
               <w:right w:w="90" w:type="dxa"/>
             </w:tcMar>
@@ -4091,6 +3917,7 @@
             </w:pPr>
             <w:r>
               <w:rPr>
+                <w:color w:val="000000"/>
                 <w:sz w:val="18"/>
               </w:rPr>
               <w:t>Cart Control and Python help [7–9]</w:t>
@@ -4101,16 +3928,16 @@
           <w:tcPr>
             <w:tcW w:type="dxa" w:w="3744"/>
             <w:vAlign w:val="center"/>
-            <w:shd w:fill="F2F5F6"/>
             <w:tcBorders>
               <w:top w:val="single" w:sz="4" w:color="D9D9D9"/>
               <w:left w:val="single" w:sz="4" w:color="D9D9D9"/>
               <w:bottom w:val="single" w:sz="4" w:color="D9D9D9"/>
               <w:right w:val="single" w:sz="4" w:color="D9D9D9"/>
             </w:tcBorders>
+            <w:shd w:fill="F2F5F6"/>
             <w:tcMar>
-              <w:top w:w="70" w:type="dxa"/>
-              <w:bottom w:w="70" w:type="dxa"/>
+              <w:top w:w="65" w:type="dxa"/>
+              <w:bottom w:w="65" w:type="dxa"/>
               <w:left w:w="90" w:type="dxa"/>
               <w:right w:w="90" w:type="dxa"/>
             </w:tcMar>
@@ -4121,6 +3948,7 @@
             </w:pPr>
             <w:r>
               <w:rPr>
+                <w:color w:val="000000"/>
                 <w:sz w:val="18"/>
               </w:rPr>
               <w:t>Sensor concepts and API checking</w:t>
@@ -4131,16 +3959,16 @@
           <w:tcPr>
             <w:tcW w:type="dxa" w:w="3701"/>
             <w:vAlign w:val="center"/>
-            <w:shd w:fill="F2F5F6"/>
             <w:tcBorders>
               <w:top w:val="single" w:sz="4" w:color="D9D9D9"/>
               <w:left w:val="single" w:sz="4" w:color="D9D9D9"/>
               <w:bottom w:val="single" w:sz="4" w:color="D9D9D9"/>
               <w:right w:val="single" w:sz="4" w:color="D9D9D9"/>
             </w:tcBorders>
+            <w:shd w:fill="F2F5F6"/>
             <w:tcMar>
-              <w:top w:w="70" w:type="dxa"/>
-              <w:bottom w:w="70" w:type="dxa"/>
+              <w:top w:w="65" w:type="dxa"/>
+              <w:bottom w:w="65" w:type="dxa"/>
               <w:left w:w="90" w:type="dxa"/>
               <w:right w:w="90" w:type="dxa"/>
             </w:tcMar>
@@ -4151,6 +3979,7 @@
             </w:pPr>
             <w:r>
               <w:rPr>
+                <w:color w:val="000000"/>
                 <w:sz w:val="18"/>
               </w:rPr>
               <w:t>Legacy Python examples may not run unchanged</w:t>
@@ -4166,16 +3995,16 @@
           <w:tcPr>
             <w:tcW w:type="dxa" w:w="2736"/>
             <w:vAlign w:val="center"/>
-            <w:shd w:fill="FFFFFF"/>
             <w:tcBorders>
               <w:top w:val="single" w:sz="4" w:color="D9D9D9"/>
               <w:left w:val="single" w:sz="4" w:color="D9D9D9"/>
               <w:bottom w:val="single" w:sz="4" w:color="D9D9D9"/>
               <w:right w:val="single" w:sz="4" w:color="D9D9D9"/>
             </w:tcBorders>
+            <w:shd w:fill="FFFFFF"/>
             <w:tcMar>
-              <w:top w:w="70" w:type="dxa"/>
-              <w:bottom w:w="70" w:type="dxa"/>
+              <w:top w:w="65" w:type="dxa"/>
+              <w:bottom w:w="65" w:type="dxa"/>
               <w:left w:w="90" w:type="dxa"/>
               <w:right w:w="90" w:type="dxa"/>
             </w:tcMar>
@@ -4186,6 +4015,7 @@
             </w:pPr>
             <w:r>
               <w:rPr>
+                <w:color w:val="000000"/>
                 <w:sz w:val="18"/>
               </w:rPr>
               <w:t>This package</w:t>
@@ -4196,16 +4026,16 @@
           <w:tcPr>
             <w:tcW w:type="dxa" w:w="3744"/>
             <w:vAlign w:val="center"/>
-            <w:shd w:fill="FFFFFF"/>
             <w:tcBorders>
               <w:top w:val="single" w:sz="4" w:color="D9D9D9"/>
               <w:left w:val="single" w:sz="4" w:color="D9D9D9"/>
               <w:bottom w:val="single" w:sz="4" w:color="D9D9D9"/>
               <w:right w:val="single" w:sz="4" w:color="D9D9D9"/>
             </w:tcBorders>
+            <w:shd w:fill="FFFFFF"/>
             <w:tcMar>
-              <w:top w:w="70" w:type="dxa"/>
-              <w:bottom w:w="70" w:type="dxa"/>
+              <w:top w:w="65" w:type="dxa"/>
+              <w:bottom w:w="65" w:type="dxa"/>
               <w:left w:w="90" w:type="dxa"/>
               <w:right w:w="90" w:type="dxa"/>
             </w:tcMar>
@@ -4216,6 +4046,7 @@
             </w:pPr>
             <w:r>
               <w:rPr>
+                <w:color w:val="000000"/>
                 <w:sz w:val="18"/>
               </w:rPr>
               <w:t>Weekly teaching sequence and complete starter files</w:t>
@@ -4226,16 +4057,16 @@
           <w:tcPr>
             <w:tcW w:type="dxa" w:w="3701"/>
             <w:vAlign w:val="center"/>
-            <w:shd w:fill="FFFFFF"/>
             <w:tcBorders>
               <w:top w:val="single" w:sz="4" w:color="D9D9D9"/>
               <w:left w:val="single" w:sz="4" w:color="D9D9D9"/>
               <w:bottom w:val="single" w:sz="4" w:color="D9D9D9"/>
               <w:right w:val="single" w:sz="4" w:color="D9D9D9"/>
             </w:tcBorders>
+            <w:shd w:fill="FFFFFF"/>
             <w:tcMar>
-              <w:top w:w="70" w:type="dxa"/>
-              <w:bottom w:w="70" w:type="dxa"/>
+              <w:top w:w="65" w:type="dxa"/>
+              <w:bottom w:w="65" w:type="dxa"/>
               <w:left w:w="90" w:type="dxa"/>
               <w:right w:w="90" w:type="dxa"/>
             </w:tcMar>
@@ -4246,6 +4077,7 @@
             </w:pPr>
             <w:r>
               <w:rPr>
+                <w:color w:val="000000"/>
                 <w:sz w:val="18"/>
               </w:rPr>
               <w:t>Requires local hardware rehearsal</w:t>
@@ -4339,7 +4171,7 @@
     </w:p>
     <w:p>
       <w:r>
-        <w:t>Offer a parent-mediated invitation to a future open house. Record opt-in interest separately from attendance and later actual team participation. Grade 7 students may not reach high school for two years. The program should remain valuable for children who never join FRC.</w:t>
+        <w:t>Offer a parent-mediated invitation to a future open house. Record opt-in interest separately from attendance and later actual team participation. Children in grades 5 and 6 are several years from high school. The program should remain valuable for children who never join FRC.</w:t>
       </w:r>
     </w:p>
     <w:p>
@@ -4352,7 +4184,7 @@
     </w:p>
     <w:p>
       <w:r>
-        <w:t>Use proposed targets as planning goals: all students get an operating turn each week; at least six of eight attend six or more sessions; most returning students explain at least three of four core concepts at the end; the YMCA requests a repeat or gives specific useful feedback. These are proposed goals, not achieved results. Report the actual denominator and missing responses.</w:t>
+        <w:t>Use proposed targets as planning goals: all 12 children get an operating turn each week; at least nine of twelve attend six or more sessions; returning students can explain at least three of four core concepts; the YMCA requests a repeat or gives specific useful feedback. These are proposed goals, not achieved results. Report actual attendance, matched responses and missing data.</w:t>
       </w:r>
     </w:p>
     <w:p>
@@ -4540,8 +4372,654 @@
     </w:p>
     <w:p>
       <w:r>
-        <w:t>The adult coordinator’s next decisions are enrollment, devices, confirmed dates, mentor staffing, storage, and a two-kit rehearsal. Use the instructor guide to turn this proposal into a local delivery plan.</w:t>
+        <w:t>The adult coordinator still needs to confirm dates, storage, charging and local procedures, and complete the two-kit rehearsal. Enrollment, grade band, available mentors and four available laptops were confirmed October 25. Use the class preparation checklists for printing and packing.</w:t>
       </w:r>
+    </w:p>
+    <w:p>
+      <w:r>
+        <w:br w:type="page"/>
+      </w:r>
+    </w:p>
+    <w:p>
+      <w:pPr>
+        <w:pStyle w:val="Heading1"/>
+      </w:pPr>
+      <w:r>
+        <w:t>Confirmed class format</w:t>
+      </w:r>
+    </w:p>
+    <w:p>
+      <w:r>
+        <w:t>12 children in grades 5–6 form four teams of three: T1/T2 share Kit A and T3/T4 share Kit B. Four student instructors cover two robot stations and two build tables; a fifth or sixth can float. The adult lead oversees the room and YMCA procedures. Bring four available laptops: two remain connected to robots and two show build references. Printed build cards make the build activity work with two laptops too.</w:t>
+      </w:r>
+    </w:p>
+    <w:p>
+      <w:r>
+        <w:t>The course introduces robotics through playful missions, student-built attachments, testing and explanation. Small Python recipes support those activities. The two drive bases stay assembled; children build a different removable feature or course model each week. Bring owned supplies after checking the per-session preparation lists. Quantities in those lists are packing targets, not confirmed inventory.</w:t>
+      </w:r>
+    </w:p>
+    <w:tbl>
+      <w:tblPr>
+        <w:tblW w:type="auto" w:w="0"/>
+        <w:jc w:val="center"/>
+        <w:tblLayout w:type="fixed"/>
+        <w:tblLook w:firstColumn="1" w:firstRow="1" w:lastColumn="0" w:lastRow="0" w:noHBand="0" w:noVBand="1" w:val="04A0"/>
+      </w:tblPr>
+      <w:tblGrid>
+        <w:gridCol w:w="864"/>
+        <w:gridCol w:w="9317"/>
+      </w:tblGrid>
+      <w:tr>
+        <w:trPr>
+          <w:cantSplit/>
+          <w:tblHeader/>
+        </w:trPr>
+        <w:tc>
+          <w:tcPr>
+            <w:tcW w:type="dxa" w:w="864"/>
+            <w:vAlign w:val="center"/>
+            <w:tcBorders>
+              <w:top w:val="single" w:sz="4" w:color="D9D9D9"/>
+              <w:left w:val="single" w:sz="4" w:color="D9D9D9"/>
+              <w:bottom w:val="single" w:sz="4" w:color="D9D9D9"/>
+              <w:right w:val="single" w:sz="4" w:color="D9D9D9"/>
+            </w:tcBorders>
+            <w:shd w:fill="243E50"/>
+            <w:tcMar>
+              <w:top w:w="65" w:type="dxa"/>
+              <w:bottom w:w="65" w:type="dxa"/>
+              <w:left w:w="90" w:type="dxa"/>
+              <w:right w:w="90" w:type="dxa"/>
+            </w:tcMar>
+          </w:tcPr>
+          <w:p>
+            <w:pPr>
+              <w:spacing w:after="20" w:line="240" w:lineRule="auto"/>
+            </w:pPr>
+            <w:r>
+              <w:rPr>
+                <w:b/>
+                <w:color w:val="FFFFFF"/>
+                <w:sz w:val="18"/>
+              </w:rPr>
+              <w:t>Week</w:t>
+            </w:r>
+          </w:p>
+        </w:tc>
+        <w:tc>
+          <w:tcPr>
+            <w:tcW w:type="dxa" w:w="9317"/>
+            <w:vAlign w:val="center"/>
+            <w:tcBorders>
+              <w:top w:val="single" w:sz="4" w:color="D9D9D9"/>
+              <w:left w:val="single" w:sz="4" w:color="D9D9D9"/>
+              <w:bottom w:val="single" w:sz="4" w:color="D9D9D9"/>
+              <w:right w:val="single" w:sz="4" w:color="D9D9D9"/>
+            </w:tcBorders>
+            <w:shd w:fill="243E50"/>
+            <w:tcMar>
+              <w:top w:w="65" w:type="dxa"/>
+              <w:bottom w:w="65" w:type="dxa"/>
+              <w:left w:w="90" w:type="dxa"/>
+              <w:right w:w="90" w:type="dxa"/>
+            </w:tcMar>
+          </w:tcPr>
+          <w:p>
+            <w:pPr>
+              <w:spacing w:after="20" w:line="240" w:lineRule="auto"/>
+            </w:pPr>
+            <w:r>
+              <w:rPr>
+                <w:b/>
+                <w:color w:val="FFFFFF"/>
+                <w:sz w:val="18"/>
+              </w:rPr>
+              <w:t>Hands on build</w:t>
+            </w:r>
+          </w:p>
+        </w:tc>
+      </w:tr>
+      <w:tr>
+        <w:trPr>
+          <w:cantSplit/>
+        </w:trPr>
+        <w:tc>
+          <w:tcPr>
+            <w:tcW w:type="dxa" w:w="864"/>
+            <w:vAlign w:val="center"/>
+            <w:tcBorders>
+              <w:top w:val="single" w:sz="4" w:color="D9D9D9"/>
+              <w:left w:val="single" w:sz="4" w:color="D9D9D9"/>
+              <w:bottom w:val="single" w:sz="4" w:color="D9D9D9"/>
+              <w:right w:val="single" w:sz="4" w:color="D9D9D9"/>
+            </w:tcBorders>
+            <w:shd w:fill="FFFFFF"/>
+            <w:tcMar>
+              <w:top w:w="65" w:type="dxa"/>
+              <w:bottom w:w="65" w:type="dxa"/>
+              <w:left w:w="90" w:type="dxa"/>
+              <w:right w:w="90" w:type="dxa"/>
+            </w:tcMar>
+          </w:tcPr>
+          <w:p>
+            <w:pPr>
+              <w:spacing w:after="20" w:line="240" w:lineRule="auto"/>
+            </w:pPr>
+            <w:r>
+              <w:rPr>
+                <w:color w:val="000000"/>
+                <w:sz w:val="18"/>
+              </w:rPr>
+              <w:t>1</w:t>
+            </w:r>
+          </w:p>
+        </w:tc>
+        <w:tc>
+          <w:tcPr>
+            <w:tcW w:type="dxa" w:w="9317"/>
+            <w:vAlign w:val="center"/>
+            <w:tcBorders>
+              <w:top w:val="single" w:sz="4" w:color="D9D9D9"/>
+              <w:left w:val="single" w:sz="4" w:color="D9D9D9"/>
+              <w:bottom w:val="single" w:sz="4" w:color="D9D9D9"/>
+              <w:right w:val="single" w:sz="4" w:color="D9D9D9"/>
+            </w:tcBorders>
+            <w:shd w:fill="FFFFFF"/>
+            <w:tcMar>
+              <w:top w:w="65" w:type="dxa"/>
+              <w:bottom w:w="65" w:type="dxa"/>
+              <w:left w:w="90" w:type="dxa"/>
+              <w:right w:w="90" w:type="dxa"/>
+            </w:tcMar>
+          </w:tcPr>
+          <w:p>
+            <w:pPr>
+              <w:spacing w:after="20" w:line="240" w:lineRule="auto"/>
+            </w:pPr>
+            <w:r>
+              <w:rPr>
+                <w:color w:val="000000"/>
+                <w:sz w:val="18"/>
+              </w:rPr>
+              <w:t>A removable robot mascot</w:t>
+            </w:r>
+          </w:p>
+        </w:tc>
+      </w:tr>
+      <w:tr>
+        <w:trPr>
+          <w:cantSplit/>
+        </w:trPr>
+        <w:tc>
+          <w:tcPr>
+            <w:tcW w:type="dxa" w:w="864"/>
+            <w:vAlign w:val="center"/>
+            <w:tcBorders>
+              <w:top w:val="single" w:sz="4" w:color="D9D9D9"/>
+              <w:left w:val="single" w:sz="4" w:color="D9D9D9"/>
+              <w:bottom w:val="single" w:sz="4" w:color="D9D9D9"/>
+              <w:right w:val="single" w:sz="4" w:color="D9D9D9"/>
+            </w:tcBorders>
+            <w:shd w:fill="F2F5F6"/>
+            <w:tcMar>
+              <w:top w:w="65" w:type="dxa"/>
+              <w:bottom w:w="65" w:type="dxa"/>
+              <w:left w:w="90" w:type="dxa"/>
+              <w:right w:w="90" w:type="dxa"/>
+            </w:tcMar>
+          </w:tcPr>
+          <w:p>
+            <w:pPr>
+              <w:spacing w:after="20" w:line="240" w:lineRule="auto"/>
+            </w:pPr>
+            <w:r>
+              <w:rPr>
+                <w:color w:val="000000"/>
+                <w:sz w:val="18"/>
+              </w:rPr>
+              <w:t>2</w:t>
+            </w:r>
+          </w:p>
+        </w:tc>
+        <w:tc>
+          <w:tcPr>
+            <w:tcW w:type="dxa" w:w="9317"/>
+            <w:vAlign w:val="center"/>
+            <w:tcBorders>
+              <w:top w:val="single" w:sz="4" w:color="D9D9D9"/>
+              <w:left w:val="single" w:sz="4" w:color="D9D9D9"/>
+              <w:bottom w:val="single" w:sz="4" w:color="D9D9D9"/>
+              <w:right w:val="single" w:sz="4" w:color="D9D9D9"/>
+            </w:tcBorders>
+            <w:shd w:fill="F2F5F6"/>
+            <w:tcMar>
+              <w:top w:w="65" w:type="dxa"/>
+              <w:bottom w:w="65" w:type="dxa"/>
+              <w:left w:w="90" w:type="dxa"/>
+              <w:right w:w="90" w:type="dxa"/>
+            </w:tcMar>
+          </w:tcPr>
+          <w:p>
+            <w:pPr>
+              <w:spacing w:after="20" w:line="240" w:lineRule="auto"/>
+            </w:pPr>
+            <w:r>
+              <w:rPr>
+                <w:color w:val="000000"/>
+                <w:sz w:val="18"/>
+              </w:rPr>
+              <w:t>A cargo tray that keeps its load</w:t>
+            </w:r>
+          </w:p>
+        </w:tc>
+      </w:tr>
+      <w:tr>
+        <w:trPr>
+          <w:cantSplit/>
+        </w:trPr>
+        <w:tc>
+          <w:tcPr>
+            <w:tcW w:type="dxa" w:w="864"/>
+            <w:vAlign w:val="center"/>
+            <w:tcBorders>
+              <w:top w:val="single" w:sz="4" w:color="D9D9D9"/>
+              <w:left w:val="single" w:sz="4" w:color="D9D9D9"/>
+              <w:bottom w:val="single" w:sz="4" w:color="D9D9D9"/>
+              <w:right w:val="single" w:sz="4" w:color="D9D9D9"/>
+            </w:tcBorders>
+            <w:shd w:fill="FFFFFF"/>
+            <w:tcMar>
+              <w:top w:w="65" w:type="dxa"/>
+              <w:bottom w:w="65" w:type="dxa"/>
+              <w:left w:w="90" w:type="dxa"/>
+              <w:right w:w="90" w:type="dxa"/>
+            </w:tcMar>
+          </w:tcPr>
+          <w:p>
+            <w:pPr>
+              <w:spacing w:after="20" w:line="240" w:lineRule="auto"/>
+            </w:pPr>
+            <w:r>
+              <w:rPr>
+                <w:color w:val="000000"/>
+                <w:sz w:val="18"/>
+              </w:rPr>
+              <w:t>3</w:t>
+            </w:r>
+          </w:p>
+        </w:tc>
+        <w:tc>
+          <w:tcPr>
+            <w:tcW w:type="dxa" w:w="9317"/>
+            <w:vAlign w:val="center"/>
+            <w:tcBorders>
+              <w:top w:val="single" w:sz="4" w:color="D9D9D9"/>
+              <w:left w:val="single" w:sz="4" w:color="D9D9D9"/>
+              <w:bottom w:val="single" w:sz="4" w:color="D9D9D9"/>
+              <w:right w:val="single" w:sz="4" w:color="D9D9D9"/>
+            </w:tcBorders>
+            <w:shd w:fill="FFFFFF"/>
+            <w:tcMar>
+              <w:top w:w="65" w:type="dxa"/>
+              <w:bottom w:w="65" w:type="dxa"/>
+              <w:left w:w="90" w:type="dxa"/>
+              <w:right w:w="90" w:type="dxa"/>
+            </w:tcMar>
+          </w:tcPr>
+          <w:p>
+            <w:pPr>
+              <w:spacing w:after="20" w:line="240" w:lineRule="auto"/>
+            </w:pPr>
+            <w:r>
+              <w:rPr>
+                <w:color w:val="000000"/>
+                <w:sz w:val="18"/>
+              </w:rPr>
+              <w:t>A dancing character with moving parts</w:t>
+            </w:r>
+          </w:p>
+        </w:tc>
+      </w:tr>
+      <w:tr>
+        <w:trPr>
+          <w:cantSplit/>
+        </w:trPr>
+        <w:tc>
+          <w:tcPr>
+            <w:tcW w:type="dxa" w:w="864"/>
+            <w:vAlign w:val="center"/>
+            <w:tcBorders>
+              <w:top w:val="single" w:sz="4" w:color="D9D9D9"/>
+              <w:left w:val="single" w:sz="4" w:color="D9D9D9"/>
+              <w:bottom w:val="single" w:sz="4" w:color="D9D9D9"/>
+              <w:right w:val="single" w:sz="4" w:color="D9D9D9"/>
+            </w:tcBorders>
+            <w:shd w:fill="F2F5F6"/>
+            <w:tcMar>
+              <w:top w:w="65" w:type="dxa"/>
+              <w:bottom w:w="65" w:type="dxa"/>
+              <w:left w:w="90" w:type="dxa"/>
+              <w:right w:w="90" w:type="dxa"/>
+            </w:tcMar>
+          </w:tcPr>
+          <w:p>
+            <w:pPr>
+              <w:spacing w:after="20" w:line="240" w:lineRule="auto"/>
+            </w:pPr>
+            <w:r>
+              <w:rPr>
+                <w:color w:val="000000"/>
+                <w:sz w:val="18"/>
+              </w:rPr>
+              <w:t>4</w:t>
+            </w:r>
+          </w:p>
+        </w:tc>
+        <w:tc>
+          <w:tcPr>
+            <w:tcW w:type="dxa" w:w="9317"/>
+            <w:vAlign w:val="center"/>
+            <w:tcBorders>
+              <w:top w:val="single" w:sz="4" w:color="D9D9D9"/>
+              <w:left w:val="single" w:sz="4" w:color="D9D9D9"/>
+              <w:bottom w:val="single" w:sz="4" w:color="D9D9D9"/>
+              <w:right w:val="single" w:sz="4" w:color="D9D9D9"/>
+            </w:tcBorders>
+            <w:shd w:fill="F2F5F6"/>
+            <w:tcMar>
+              <w:top w:w="65" w:type="dxa"/>
+              <w:bottom w:w="65" w:type="dxa"/>
+              <w:left w:w="90" w:type="dxa"/>
+              <w:right w:w="90" w:type="dxa"/>
+            </w:tcMar>
+          </w:tcPr>
+          <w:p>
+            <w:pPr>
+              <w:spacing w:after="20" w:line="240" w:lineRule="auto"/>
+            </w:pPr>
+            <w:r>
+              <w:rPr>
+                <w:color w:val="000000"/>
+                <w:sz w:val="18"/>
+              </w:rPr>
+              <w:t>A garage with a dependable target wall</w:t>
+            </w:r>
+          </w:p>
+        </w:tc>
+      </w:tr>
+      <w:tr>
+        <w:trPr>
+          <w:cantSplit/>
+        </w:trPr>
+        <w:tc>
+          <w:tcPr>
+            <w:tcW w:type="dxa" w:w="864"/>
+            <w:vAlign w:val="center"/>
+            <w:tcBorders>
+              <w:top w:val="single" w:sz="4" w:color="D9D9D9"/>
+              <w:left w:val="single" w:sz="4" w:color="D9D9D9"/>
+              <w:bottom w:val="single" w:sz="4" w:color="D9D9D9"/>
+              <w:right w:val="single" w:sz="4" w:color="D9D9D9"/>
+            </w:tcBorders>
+            <w:shd w:fill="FFFFFF"/>
+            <w:tcMar>
+              <w:top w:w="65" w:type="dxa"/>
+              <w:bottom w:w="65" w:type="dxa"/>
+              <w:left w:w="90" w:type="dxa"/>
+              <w:right w:w="90" w:type="dxa"/>
+            </w:tcMar>
+          </w:tcPr>
+          <w:p>
+            <w:pPr>
+              <w:spacing w:after="20" w:line="240" w:lineRule="auto"/>
+            </w:pPr>
+            <w:r>
+              <w:rPr>
+                <w:color w:val="000000"/>
+                <w:sz w:val="18"/>
+              </w:rPr>
+              <w:t>5</w:t>
+            </w:r>
+          </w:p>
+        </w:tc>
+        <w:tc>
+          <w:tcPr>
+            <w:tcW w:type="dxa" w:w="9317"/>
+            <w:vAlign w:val="center"/>
+            <w:tcBorders>
+              <w:top w:val="single" w:sz="4" w:color="D9D9D9"/>
+              <w:left w:val="single" w:sz="4" w:color="D9D9D9"/>
+              <w:bottom w:val="single" w:sz="4" w:color="D9D9D9"/>
+              <w:right w:val="single" w:sz="4" w:color="D9D9D9"/>
+            </w:tcBorders>
+            <w:shd w:fill="FFFFFF"/>
+            <w:tcMar>
+              <w:top w:w="65" w:type="dxa"/>
+              <w:bottom w:w="65" w:type="dxa"/>
+              <w:left w:w="90" w:type="dxa"/>
+              <w:right w:w="90" w:type="dxa"/>
+            </w:tcMar>
+          </w:tcPr>
+          <w:p>
+            <w:pPr>
+              <w:spacing w:after="20" w:line="240" w:lineRule="auto"/>
+            </w:pPr>
+            <w:r>
+              <w:rPr>
+                <w:color w:val="000000"/>
+                <w:sz w:val="18"/>
+              </w:rPr>
+              <w:t>A road with a delivery marker</w:t>
+            </w:r>
+          </w:p>
+        </w:tc>
+      </w:tr>
+      <w:tr>
+        <w:trPr>
+          <w:cantSplit/>
+        </w:trPr>
+        <w:tc>
+          <w:tcPr>
+            <w:tcW w:type="dxa" w:w="864"/>
+            <w:vAlign w:val="center"/>
+            <w:tcBorders>
+              <w:top w:val="single" w:sz="4" w:color="D9D9D9"/>
+              <w:left w:val="single" w:sz="4" w:color="D9D9D9"/>
+              <w:bottom w:val="single" w:sz="4" w:color="D9D9D9"/>
+              <w:right w:val="single" w:sz="4" w:color="D9D9D9"/>
+            </w:tcBorders>
+            <w:shd w:fill="F2F5F6"/>
+            <w:tcMar>
+              <w:top w:w="65" w:type="dxa"/>
+              <w:bottom w:w="65" w:type="dxa"/>
+              <w:left w:w="90" w:type="dxa"/>
+              <w:right w:w="90" w:type="dxa"/>
+            </w:tcMar>
+          </w:tcPr>
+          <w:p>
+            <w:pPr>
+              <w:spacing w:after="20" w:line="240" w:lineRule="auto"/>
+            </w:pPr>
+            <w:r>
+              <w:rPr>
+                <w:color w:val="000000"/>
+                <w:sz w:val="18"/>
+              </w:rPr>
+              <w:t>6</w:t>
+            </w:r>
+          </w:p>
+        </w:tc>
+        <w:tc>
+          <w:tcPr>
+            <w:tcW w:type="dxa" w:w="9317"/>
+            <w:vAlign w:val="center"/>
+            <w:tcBorders>
+              <w:top w:val="single" w:sz="4" w:color="D9D9D9"/>
+              <w:left w:val="single" w:sz="4" w:color="D9D9D9"/>
+              <w:bottom w:val="single" w:sz="4" w:color="D9D9D9"/>
+              <w:right w:val="single" w:sz="4" w:color="D9D9D9"/>
+            </w:tcBorders>
+            <w:shd w:fill="F2F5F6"/>
+            <w:tcMar>
+              <w:top w:w="65" w:type="dxa"/>
+              <w:bottom w:w="65" w:type="dxa"/>
+              <w:left w:w="90" w:type="dxa"/>
+              <w:right w:w="90" w:type="dxa"/>
+            </w:tcMar>
+          </w:tcPr>
+          <w:p>
+            <w:pPr>
+              <w:spacing w:after="20" w:line="240" w:lineRule="auto"/>
+            </w:pPr>
+            <w:r>
+              <w:rPr>
+                <w:color w:val="000000"/>
+                <w:sz w:val="18"/>
+              </w:rPr>
+              <w:t>A rescue scoop or guide</w:t>
+            </w:r>
+          </w:p>
+        </w:tc>
+      </w:tr>
+      <w:tr>
+        <w:trPr>
+          <w:cantSplit/>
+        </w:trPr>
+        <w:tc>
+          <w:tcPr>
+            <w:tcW w:type="dxa" w:w="864"/>
+            <w:vAlign w:val="center"/>
+            <w:tcBorders>
+              <w:top w:val="single" w:sz="4" w:color="D9D9D9"/>
+              <w:left w:val="single" w:sz="4" w:color="D9D9D9"/>
+              <w:bottom w:val="single" w:sz="4" w:color="D9D9D9"/>
+              <w:right w:val="single" w:sz="4" w:color="D9D9D9"/>
+            </w:tcBorders>
+            <w:shd w:fill="FFFFFF"/>
+            <w:tcMar>
+              <w:top w:w="65" w:type="dxa"/>
+              <w:bottom w:w="65" w:type="dxa"/>
+              <w:left w:w="90" w:type="dxa"/>
+              <w:right w:w="90" w:type="dxa"/>
+            </w:tcMar>
+          </w:tcPr>
+          <w:p>
+            <w:pPr>
+              <w:spacing w:after="20" w:line="240" w:lineRule="auto"/>
+            </w:pPr>
+            <w:r>
+              <w:rPr>
+                <w:color w:val="000000"/>
+                <w:sz w:val="18"/>
+              </w:rPr>
+              <w:t>7</w:t>
+            </w:r>
+          </w:p>
+        </w:tc>
+        <w:tc>
+          <w:tcPr>
+            <w:tcW w:type="dxa" w:w="9317"/>
+            <w:vAlign w:val="center"/>
+            <w:tcBorders>
+              <w:top w:val="single" w:sz="4" w:color="D9D9D9"/>
+              <w:left w:val="single" w:sz="4" w:color="D9D9D9"/>
+              <w:bottom w:val="single" w:sz="4" w:color="D9D9D9"/>
+              <w:right w:val="single" w:sz="4" w:color="D9D9D9"/>
+            </w:tcBorders>
+            <w:shd w:fill="FFFFFF"/>
+            <w:tcMar>
+              <w:top w:w="65" w:type="dxa"/>
+              <w:bottom w:w="65" w:type="dxa"/>
+              <w:left w:w="90" w:type="dxa"/>
+              <w:right w:w="90" w:type="dxa"/>
+            </w:tcMar>
+          </w:tcPr>
+          <w:p>
+            <w:pPr>
+              <w:spacing w:after="20" w:line="240" w:lineRule="auto"/>
+            </w:pPr>
+            <w:r>
+              <w:rPr>
+                <w:color w:val="000000"/>
+                <w:sz w:val="18"/>
+              </w:rPr>
+              <w:t>A small community mission scene</w:t>
+            </w:r>
+          </w:p>
+        </w:tc>
+      </w:tr>
+      <w:tr>
+        <w:trPr>
+          <w:cantSplit/>
+        </w:trPr>
+        <w:tc>
+          <w:tcPr>
+            <w:tcW w:type="dxa" w:w="864"/>
+            <w:vAlign w:val="center"/>
+            <w:tcBorders>
+              <w:top w:val="single" w:sz="4" w:color="D9D9D9"/>
+              <w:left w:val="single" w:sz="4" w:color="D9D9D9"/>
+              <w:bottom w:val="single" w:sz="4" w:color="D9D9D9"/>
+              <w:right w:val="single" w:sz="4" w:color="D9D9D9"/>
+            </w:tcBorders>
+            <w:shd w:fill="F2F5F6"/>
+            <w:tcMar>
+              <w:top w:w="65" w:type="dxa"/>
+              <w:bottom w:w="65" w:type="dxa"/>
+              <w:left w:w="90" w:type="dxa"/>
+              <w:right w:w="90" w:type="dxa"/>
+            </w:tcMar>
+          </w:tcPr>
+          <w:p>
+            <w:pPr>
+              <w:spacing w:after="20" w:line="240" w:lineRule="auto"/>
+            </w:pPr>
+            <w:r>
+              <w:rPr>
+                <w:color w:val="000000"/>
+                <w:sz w:val="18"/>
+              </w:rPr>
+              <w:t>8</w:t>
+            </w:r>
+          </w:p>
+        </w:tc>
+        <w:tc>
+          <w:tcPr>
+            <w:tcW w:type="dxa" w:w="9317"/>
+            <w:vAlign w:val="center"/>
+            <w:tcBorders>
+              <w:top w:val="single" w:sz="4" w:color="D9D9D9"/>
+              <w:left w:val="single" w:sz="4" w:color="D9D9D9"/>
+              <w:bottom w:val="single" w:sz="4" w:color="D9D9D9"/>
+              <w:right w:val="single" w:sz="4" w:color="D9D9D9"/>
+            </w:tcBorders>
+            <w:shd w:fill="F2F5F6"/>
+            <w:tcMar>
+              <w:top w:w="65" w:type="dxa"/>
+              <w:bottom w:w="65" w:type="dxa"/>
+              <w:left w:w="90" w:type="dxa"/>
+              <w:right w:w="90" w:type="dxa"/>
+            </w:tcMar>
+          </w:tcPr>
+          <w:p>
+            <w:pPr>
+              <w:spacing w:after="20" w:line="240" w:lineRule="auto"/>
+            </w:pPr>
+            <w:r>
+              <w:rPr>
+                <w:color w:val="000000"/>
+                <w:sz w:val="18"/>
+              </w:rPr>
+              <w:t>A working exhibit for the showcase</w:t>
+            </w:r>
+          </w:p>
+        </w:tc>
+      </w:tr>
+    </w:tbl>
+    <w:p>
+      <w:pPr>
+        <w:spacing w:after="0"/>
+      </w:pPr>
     </w:p>
     <w:sectPr>
       <w:headerReference w:type="default" r:id="rId9"/>

</xml_diff>